<commit_message>
docs: add screenshots to user guide
</commit_message>
<xml_diff>
--- a/outputs/user-guide/LEVIEN_CAFE_User_Guide.docx
+++ b/outputs/user-guide/LEVIEN_CAFE_User_Guide.docx
@@ -4,12 +4,8 @@
   <w:body>
     <w:p>
       <w:pPr>
-        <w:spacing w:after="840"/>
-      </w:pPr>
-    </w:p>
-    <w:p>
-      <w:pPr>
-        <w:spacing w:after="80"/>
+        <w:spacing w:before="1800"/>
+        <w:jc w:val="center"/>
       </w:pPr>
       <w:r>
         <w:rPr>
@@ -18,115 +14,118 @@
           <w:color w:val="D9A514"/>
           <w:sz w:val="18"/>
         </w:rPr>
-        <w:t>OPERATIONS AND CUSTOMER EXPERIENCE</w:t>
+        <w:t>OPERATIONS &amp; CUSTOMER EXPERIENCE</w:t>
       </w:r>
     </w:p>
     <w:p>
       <w:pPr>
-        <w:pStyle w:val="Title"/>
-        <w:spacing w:after="240"/>
+        <w:spacing w:after="160"/>
+        <w:jc w:val="center"/>
       </w:pPr>
       <w:r>
+        <w:rPr>
+          <w:rFonts w:ascii="Aptos Display" w:hAnsi="Aptos Display"/>
+          <w:b/>
+          <w:color w:val="0F513A"/>
+          <w:sz w:val="62"/>
+        </w:rPr>
         <w:t>LEVIEN CAFE</w:t>
-        <w:br/>
-        <w:t>User Guide</w:t>
       </w:r>
     </w:p>
     <w:p>
       <w:pPr>
-        <w:pStyle w:val="Subtitle"/>
-        <w:spacing w:after="480"/>
+        <w:spacing w:after="440"/>
+        <w:jc w:val="center"/>
       </w:pPr>
       <w:r>
-        <w:t>Role-based instructions for customers, staff, supervisors, managers, and owners</w:t>
+        <w:rPr>
+          <w:rFonts w:ascii="Aptos Display" w:hAnsi="Aptos Display"/>
+          <w:b/>
+          <w:color w:val="1B2420"/>
+          <w:sz w:val="40"/>
+        </w:rPr>
+        <w:t>Visual User Guide</w:t>
       </w:r>
     </w:p>
     <w:p>
       <w:pPr>
-        <w:spacing w:before="100" w:after="160" w:line="269" w:lineRule="auto"/>
-        <w:ind w:left="173" w:right="173"/>
-        <w:shd w:fill="EDF5F1"/>
+        <w:jc w:val="center"/>
+      </w:pPr>
+      <w:r>
+        <w:rPr>
+          <w:rFonts w:ascii="Aptos" w:hAnsi="Aptos"/>
+          <w:b w:val="0"/>
+          <w:color w:val="66756E"/>
+          <w:sz w:val="24"/>
+        </w:rPr>
+        <w:t>Step-by-step instructions for Customers, Staff, Supervisors, Managers, and Owners</w:t>
+      </w:r>
+    </w:p>
+    <w:tbl>
+      <w:tblPr>
+        <w:tblW w:type="auto" w:w="0"/>
+        <w:tblLayout w:type="fixed"/>
+        <w:tblLook w:firstColumn="1" w:firstRow="1" w:lastColumn="0" w:lastRow="0" w:noHBand="0" w:noVBand="1" w:val="04A0"/>
+      </w:tblPr>
+      <w:tblGrid>
+        <w:gridCol w:w="9360"/>
+      </w:tblGrid>
+      <w:tr>
+        <w:tc>
+          <w:tcPr>
+            <w:tcW w:type="dxa" w:w="9360"/>
+            <w:shd w:fill="EDF5F1"/>
+            <w:tcMar>
+              <w:top w:w="130" w:type="dxa"/>
+              <w:start w:w="160" w:type="dxa"/>
+              <w:bottom w:w="130" w:type="dxa"/>
+              <w:end w:w="160" w:type="dxa"/>
+            </w:tcMar>
+          </w:tcPr>
+          <w:p>
+            <w:pPr>
+              <w:spacing w:after="0"/>
+            </w:pPr>
+            <w:r>
+              <w:rPr>
+                <w:rFonts w:ascii="Aptos" w:hAnsi="Aptos"/>
+                <w:b/>
+                <w:color w:val="0F513A"/>
+                <w:sz w:val="21"/>
+              </w:rPr>
+              <w:t xml:space="preserve">How to use this guide: </w:t>
+            </w:r>
+            <w:r>
+              <w:rPr>
+                <w:rFonts w:ascii="Aptos" w:hAnsi="Aptos"/>
+                <w:b w:val="0"/>
+                <w:color w:val="1B2420"/>
+                <w:sz w:val="21"/>
+              </w:rPr>
+              <w:t>Go directly to your role. Screenshots show the page or control used for each workflow. Interface labels are written exactly as they appear in the application.</w:t>
+            </w:r>
+          </w:p>
+        </w:tc>
+      </w:tr>
+    </w:tbl>
+    <w:p>
+      <w:pPr>
+        <w:spacing w:after="20"/>
+      </w:pPr>
+    </w:p>
+    <w:p>
+      <w:pPr>
+        <w:spacing w:before="1200"/>
+        <w:jc w:val="center"/>
       </w:pPr>
       <w:r>
         <w:rPr>
           <w:rFonts w:ascii="Aptos" w:hAnsi="Aptos"/>
           <w:b/>
-          <w:color w:val="0F513A"/>
-          <w:sz w:val="20"/>
+          <w:color w:val="66756E"/>
+          <w:sz w:val="19"/>
         </w:rPr>
-        <w:t xml:space="preserve">Purpose: </w:t>
-      </w:r>
-      <w:r>
-        <w:rPr>
-          <w:rFonts w:ascii="Aptos" w:hAnsi="Aptos"/>
-          <w:color w:val="1B2420"/>
-          <w:sz w:val="20"/>
-        </w:rPr>
-        <w:t>Use this guide to complete everyday tasks in the LEVIEN CAFE website and Admin workspace. No technical knowledge is required.</w:t>
-      </w:r>
-    </w:p>
-    <w:p>
-      <w:pPr>
-        <w:spacing w:after="720"/>
-      </w:pPr>
-    </w:p>
-    <w:p>
-      <w:pPr>
-        <w:jc w:val="left"/>
-      </w:pPr>
-      <w:r>
-        <w:rPr>
-          <w:rFonts w:ascii="Aptos" w:hAnsi="Aptos"/>
-          <w:b/>
-          <w:color w:val="0F513A"/>
-          <w:sz w:val="20"/>
-        </w:rPr>
-        <w:t xml:space="preserve">Edition: </w:t>
-      </w:r>
-      <w:r>
-        <w:rPr>
-          <w:rFonts w:ascii="Aptos" w:hAnsi="Aptos"/>
-          <w:color w:val="66756E"/>
-          <w:sz w:val="20"/>
-        </w:rPr>
-        <w:t>1.0</w:t>
-        <w:br/>
-      </w:r>
-      <w:r>
-        <w:rPr>
-          <w:rFonts w:ascii="Aptos" w:hAnsi="Aptos"/>
-          <w:b/>
-          <w:color w:val="0F513A"/>
-          <w:sz w:val="20"/>
-        </w:rPr>
-        <w:t xml:space="preserve">Updated: </w:t>
-      </w:r>
-      <w:r>
-        <w:rPr>
-          <w:rFonts w:ascii="Aptos" w:hAnsi="Aptos"/>
-          <w:color w:val="66756E"/>
-          <w:sz w:val="20"/>
-        </w:rPr>
-        <w:t>August 30, 2026</w:t>
-        <w:br/>
-      </w:r>
-      <w:r>
-        <w:rPr>
-          <w:rFonts w:ascii="Aptos" w:hAnsi="Aptos"/>
-          <w:b/>
-          <w:color w:val="0F513A"/>
-          <w:sz w:val="20"/>
-        </w:rPr>
-        <w:t xml:space="preserve">Language: </w:t>
-      </w:r>
-      <w:r>
-        <w:rPr>
-          <w:rFonts w:ascii="Aptos" w:hAnsi="Aptos"/>
-          <w:color w:val="66756E"/>
-          <w:sz w:val="20"/>
-        </w:rPr>
-        <w:t>English</w:t>
-        <w:br/>
+        <w:t>Edition 1.1  •  August 2026  •  English</w:t>
       </w:r>
     </w:p>
     <w:p>
@@ -156,34 +155,27 @@
         <w:t>Choose Your Role</w:t>
       </w:r>
     </w:p>
-    <w:p>
-      <w:r>
-        <w:t>Your account role controls which pages and actions you can see. If a feature in this guide is not visible, your role may not have access to it.</w:t>
-      </w:r>
-    </w:p>
     <w:tbl>
       <w:tblPr>
-        <w:tblStyle w:val="TableGrid"/>
-        <w:tblW w:type="dxa" w:w="9360"/>
-        <w:jc w:val="left"/>
+        <w:tblW w:type="auto" w:w="0"/>
         <w:tblLayout w:type="fixed"/>
         <w:tblLook w:firstColumn="1" w:firstRow="1" w:lastColumn="0" w:lastRow="0" w:noHBand="0" w:noVBand="1" w:val="04A0"/>
-        <w:tblInd w:w="120" w:type="dxa"/>
       </w:tblPr>
       <w:tblGrid>
-        <w:gridCol w:w="1500"/>
-        <w:gridCol w:w="3900"/>
-        <w:gridCol w:w="3960"/>
+        <w:gridCol w:w="2088"/>
+        <w:gridCol w:w="7272"/>
       </w:tblGrid>
       <w:tr>
-        <w:trPr>
-          <w:tblHeader w:val="true"/>
-        </w:trPr>
         <w:tc>
           <w:tcPr>
-            <w:tcW w:type="dxa" w:w="1500"/>
+            <w:tcW w:type="dxa" w:w="4680"/>
             <w:shd w:fill="0F513A"/>
-            <w:vAlign w:val="center"/>
+            <w:tcMar>
+              <w:top w:w="90" w:type="dxa"/>
+              <w:start w:w="130" w:type="dxa"/>
+              <w:bottom w:w="90" w:type="dxa"/>
+              <w:end w:w="130" w:type="dxa"/>
+            </w:tcMar>
           </w:tcPr>
           <w:p>
             <w:r>
@@ -191,7 +183,7 @@
                 <w:rFonts w:ascii="Aptos" w:hAnsi="Aptos"/>
                 <w:b/>
                 <w:color w:val="FFFFFF"/>
-                <w:sz w:val="19"/>
+                <w:sz w:val="20"/>
               </w:rPr>
               <w:t>Role</w:t>
             </w:r>
@@ -199,9 +191,14 @@
         </w:tc>
         <w:tc>
           <w:tcPr>
-            <w:tcW w:type="dxa" w:w="3900"/>
+            <w:tcW w:type="dxa" w:w="4680"/>
             <w:shd w:fill="0F513A"/>
-            <w:vAlign w:val="center"/>
+            <w:tcMar>
+              <w:top w:w="90" w:type="dxa"/>
+              <w:start w:w="130" w:type="dxa"/>
+              <w:bottom w:w="90" w:type="dxa"/>
+              <w:end w:w="130" w:type="dxa"/>
+            </w:tcMar>
           </w:tcPr>
           <w:p>
             <w:r>
@@ -209,27 +206,9 @@
                 <w:rFonts w:ascii="Aptos" w:hAnsi="Aptos"/>
                 <w:b/>
                 <w:color w:val="FFFFFF"/>
-                <w:sz w:val="19"/>
+                <w:sz w:val="20"/>
               </w:rPr>
-              <w:t>Use the system for</w:t>
-            </w:r>
-          </w:p>
-        </w:tc>
-        <w:tc>
-          <w:tcPr>
-            <w:tcW w:type="dxa" w:w="3960"/>
-            <w:shd w:fill="0F513A"/>
-            <w:vAlign w:val="center"/>
-          </w:tcPr>
-          <w:p>
-            <w:r>
-              <w:rPr>
-                <w:rFonts w:ascii="Aptos" w:hAnsi="Aptos"/>
-                <w:b/>
-                <w:color w:val="FFFFFF"/>
-                <w:sz w:val="19"/>
-              </w:rPr>
-              <w:t>Main workspace</w:t>
+              <w:t>Primary tasks</w:t>
             </w:r>
           </w:p>
         </w:tc>
@@ -237,16 +216,23 @@
       <w:tr>
         <w:tc>
           <w:tcPr>
-            <w:tcW w:type="dxa" w:w="1500"/>
+            <w:tcW w:type="dxa" w:w="2088"/>
+            <w:tcMar>
+              <w:top w:w="90" w:type="dxa"/>
+              <w:start w:w="130" w:type="dxa"/>
+              <w:bottom w:w="90" w:type="dxa"/>
+              <w:end w:w="130" w:type="dxa"/>
+            </w:tcMar>
+            <w:vAlign w:val="center"/>
             <w:shd w:fill="EDF5F1"/>
-            <w:vAlign w:val="center"/>
           </w:tcPr>
           <w:p>
             <w:r>
               <w:rPr>
                 <w:rFonts w:ascii="Aptos" w:hAnsi="Aptos"/>
                 <w:b/>
-                <w:sz w:val="18"/>
+                <w:color w:val="0F513A"/>
+                <w:sz w:val="20"/>
               </w:rPr>
               <w:t>Customer</w:t>
             </w:r>
@@ -254,33 +240,18 @@
         </w:tc>
         <w:tc>
           <w:tcPr>
-            <w:tcW w:type="dxa" w:w="3900"/>
+            <w:tcW w:type="dxa" w:w="7272"/>
+            <w:tcMar>
+              <w:top w:w="90" w:type="dxa"/>
+              <w:start w:w="130" w:type="dxa"/>
+              <w:bottom w:w="90" w:type="dxa"/>
+              <w:end w:w="130" w:type="dxa"/>
+            </w:tcMar>
             <w:vAlign w:val="center"/>
           </w:tcPr>
           <w:p>
             <w:r>
-              <w:rPr>
-                <w:rFonts w:ascii="Aptos" w:hAnsi="Aptos"/>
-                <w:b w:val="0"/>
-                <w:sz w:val="18"/>
-              </w:rPr>
-              <w:t>Browse, order, track orders, use member rewards and gift cards</w:t>
-            </w:r>
-          </w:p>
-        </w:tc>
-        <w:tc>
-          <w:tcPr>
-            <w:tcW w:type="dxa" w:w="3960"/>
-            <w:vAlign w:val="center"/>
-          </w:tcPr>
-          <w:p>
-            <w:r>
-              <w:rPr>
-                <w:rFonts w:ascii="Aptos" w:hAnsi="Aptos"/>
-                <w:b w:val="0"/>
-                <w:sz w:val="18"/>
-              </w:rPr>
-              <w:t>Public website and My Account</w:t>
+              <w:t>Browse, customize, order, track, rewards, gift cards</w:t>
             </w:r>
           </w:p>
         </w:tc>
@@ -288,16 +259,23 @@
       <w:tr>
         <w:tc>
           <w:tcPr>
-            <w:tcW w:type="dxa" w:w="1500"/>
+            <w:tcW w:type="dxa" w:w="2088"/>
+            <w:tcMar>
+              <w:top w:w="90" w:type="dxa"/>
+              <w:start w:w="130" w:type="dxa"/>
+              <w:bottom w:w="90" w:type="dxa"/>
+              <w:end w:w="130" w:type="dxa"/>
+            </w:tcMar>
+            <w:vAlign w:val="center"/>
             <w:shd w:fill="EDF5F1"/>
-            <w:vAlign w:val="center"/>
           </w:tcPr>
           <w:p>
             <w:r>
               <w:rPr>
                 <w:rFonts w:ascii="Aptos" w:hAnsi="Aptos"/>
                 <w:b/>
-                <w:sz w:val="18"/>
+                <w:color w:val="0F513A"/>
+                <w:sz w:val="20"/>
               </w:rPr>
               <w:t>Staff</w:t>
             </w:r>
@@ -305,33 +283,18 @@
         </w:tc>
         <w:tc>
           <w:tcPr>
-            <w:tcW w:type="dxa" w:w="3900"/>
+            <w:tcW w:type="dxa" w:w="7272"/>
+            <w:tcMar>
+              <w:top w:w="90" w:type="dxa"/>
+              <w:start w:w="130" w:type="dxa"/>
+              <w:bottom w:w="90" w:type="dxa"/>
+              <w:end w:w="130" w:type="dxa"/>
+            </w:tcMar>
             <w:vAlign w:val="center"/>
           </w:tcPr>
           <w:p>
             <w:r>
-              <w:rPr>
-                <w:rFonts w:ascii="Aptos" w:hAnsi="Aptos"/>
-                <w:b w:val="0"/>
-                <w:sz w:val="18"/>
-              </w:rPr>
-              <w:t>Handle orders, create counter orders, find members, view/register shifts</w:t>
-            </w:r>
-          </w:p>
-        </w:tc>
-        <w:tc>
-          <w:tcPr>
-            <w:tcW w:type="dxa" w:w="3960"/>
-            <w:vAlign w:val="center"/>
-          </w:tcPr>
-          <w:p>
-            <w:r>
-              <w:rPr>
-                <w:rFonts w:ascii="Aptos" w:hAnsi="Aptos"/>
-                <w:b w:val="0"/>
-                <w:sz w:val="18"/>
-              </w:rPr>
-              <w:t>Admin &gt; Orders / My Workspace</w:t>
+              <w:t>Orders, counter orders, member lookup, availability, own schedule</w:t>
             </w:r>
           </w:p>
         </w:tc>
@@ -339,16 +302,23 @@
       <w:tr>
         <w:tc>
           <w:tcPr>
-            <w:tcW w:type="dxa" w:w="1500"/>
+            <w:tcW w:type="dxa" w:w="2088"/>
+            <w:tcMar>
+              <w:top w:w="90" w:type="dxa"/>
+              <w:start w:w="130" w:type="dxa"/>
+              <w:bottom w:w="90" w:type="dxa"/>
+              <w:end w:w="130" w:type="dxa"/>
+            </w:tcMar>
+            <w:vAlign w:val="center"/>
             <w:shd w:fill="EDF5F1"/>
-            <w:vAlign w:val="center"/>
           </w:tcPr>
           <w:p>
             <w:r>
               <w:rPr>
                 <w:rFonts w:ascii="Aptos" w:hAnsi="Aptos"/>
                 <w:b/>
-                <w:sz w:val="18"/>
+                <w:color w:val="0F513A"/>
+                <w:sz w:val="20"/>
               </w:rPr>
               <w:t>Supervisor</w:t>
             </w:r>
@@ -356,33 +326,18 @@
         </w:tc>
         <w:tc>
           <w:tcPr>
-            <w:tcW w:type="dxa" w:w="3900"/>
+            <w:tcW w:type="dxa" w:w="7272"/>
+            <w:tcMar>
+              <w:top w:w="90" w:type="dxa"/>
+              <w:start w:w="130" w:type="dxa"/>
+              <w:bottom w:w="90" w:type="dxa"/>
+              <w:end w:w="130" w:type="dxa"/>
+            </w:tcMar>
             <w:vAlign w:val="center"/>
           </w:tcPr>
           <w:p>
             <w:r>
-              <w:rPr>
-                <w:rFonts w:ascii="Aptos" w:hAnsi="Aptos"/>
-                <w:b w:val="0"/>
-                <w:sz w:val="18"/>
-              </w:rPr>
-              <w:t>All Staff tasks plus team-facing order oversight</w:t>
-            </w:r>
-          </w:p>
-        </w:tc>
-        <w:tc>
-          <w:tcPr>
-            <w:tcW w:type="dxa" w:w="3960"/>
-            <w:vAlign w:val="center"/>
-          </w:tcPr>
-          <w:p>
-            <w:r>
-              <w:rPr>
-                <w:rFonts w:ascii="Aptos" w:hAnsi="Aptos"/>
-                <w:b w:val="0"/>
-                <w:sz w:val="18"/>
-              </w:rPr>
-              <w:t>Admin dashboard and operations</w:t>
+              <w:t>All Staff workflows plus shift-level order oversight</w:t>
             </w:r>
           </w:p>
         </w:tc>
@@ -390,16 +345,23 @@
       <w:tr>
         <w:tc>
           <w:tcPr>
-            <w:tcW w:type="dxa" w:w="1500"/>
+            <w:tcW w:type="dxa" w:w="2088"/>
+            <w:tcMar>
+              <w:top w:w="90" w:type="dxa"/>
+              <w:start w:w="130" w:type="dxa"/>
+              <w:bottom w:w="90" w:type="dxa"/>
+              <w:end w:w="130" w:type="dxa"/>
+            </w:tcMar>
+            <w:vAlign w:val="center"/>
             <w:shd w:fill="EDF5F1"/>
-            <w:vAlign w:val="center"/>
           </w:tcPr>
           <w:p>
             <w:r>
               <w:rPr>
                 <w:rFonts w:ascii="Aptos" w:hAnsi="Aptos"/>
                 <w:b/>
-                <w:sz w:val="18"/>
+                <w:color w:val="0F513A"/>
+                <w:sz w:val="20"/>
               </w:rPr>
               <w:t>Manager</w:t>
             </w:r>
@@ -407,33 +369,18 @@
         </w:tc>
         <w:tc>
           <w:tcPr>
-            <w:tcW w:type="dxa" w:w="3900"/>
+            <w:tcW w:type="dxa" w:w="7272"/>
+            <w:tcMar>
+              <w:top w:w="90" w:type="dxa"/>
+              <w:start w:w="130" w:type="dxa"/>
+              <w:bottom w:w="90" w:type="dxa"/>
+              <w:end w:w="130" w:type="dxa"/>
+            </w:tcMar>
             <w:vAlign w:val="center"/>
           </w:tcPr>
           <w:p>
             <w:r>
-              <w:rPr>
-                <w:rFonts w:ascii="Aptos" w:hAnsi="Aptos"/>
-                <w:b w:val="0"/>
-                <w:sz w:val="18"/>
-              </w:rPr>
-              <w:t>Run store operations, schedules, catalog, loyalty, customers, and reports</w:t>
-            </w:r>
-          </w:p>
-        </w:tc>
-        <w:tc>
-          <w:tcPr>
-            <w:tcW w:type="dxa" w:w="3960"/>
-            <w:vAlign w:val="center"/>
-          </w:tcPr>
-          <w:p>
-            <w:r>
-              <w:rPr>
-                <w:rFonts w:ascii="Aptos" w:hAnsi="Aptos"/>
-                <w:b w:val="0"/>
-                <w:sz w:val="18"/>
-              </w:rPr>
-              <w:t>Full Admin workspace</w:t>
+              <w:t>Schedules, employees, catalog, loyalty, reports</w:t>
             </w:r>
           </w:p>
         </w:tc>
@@ -441,16 +388,23 @@
       <w:tr>
         <w:tc>
           <w:tcPr>
-            <w:tcW w:type="dxa" w:w="1500"/>
+            <w:tcW w:type="dxa" w:w="2088"/>
+            <w:tcMar>
+              <w:top w:w="90" w:type="dxa"/>
+              <w:start w:w="130" w:type="dxa"/>
+              <w:bottom w:w="90" w:type="dxa"/>
+              <w:end w:w="130" w:type="dxa"/>
+            </w:tcMar>
+            <w:vAlign w:val="center"/>
             <w:shd w:fill="EDF5F1"/>
-            <w:vAlign w:val="center"/>
           </w:tcPr>
           <w:p>
             <w:r>
               <w:rPr>
                 <w:rFonts w:ascii="Aptos" w:hAnsi="Aptos"/>
                 <w:b/>
-                <w:sz w:val="18"/>
+                <w:color w:val="0F513A"/>
+                <w:sz w:val="20"/>
               </w:rPr>
               <w:t>Owner</w:t>
             </w:r>
@@ -458,33 +412,65 @@
         </w:tc>
         <w:tc>
           <w:tcPr>
-            <w:tcW w:type="dxa" w:w="3900"/>
+            <w:tcW w:type="dxa" w:w="7272"/>
+            <w:tcMar>
+              <w:top w:w="90" w:type="dxa"/>
+              <w:start w:w="130" w:type="dxa"/>
+              <w:bottom w:w="90" w:type="dxa"/>
+              <w:end w:w="130" w:type="dxa"/>
+            </w:tcMar>
             <w:vAlign w:val="center"/>
           </w:tcPr>
           <w:p>
             <w:r>
-              <w:rPr>
-                <w:rFonts w:ascii="Aptos" w:hAnsi="Aptos"/>
-                <w:b w:val="0"/>
-                <w:sz w:val="18"/>
-              </w:rPr>
-              <w:t>All Manager tasks plus store governance and sensitive review</w:t>
+              <w:t>All Manager workflows plus access, compensation, and policy</w:t>
             </w:r>
           </w:p>
         </w:tc>
+      </w:tr>
+    </w:tbl>
+    <w:tbl>
+      <w:tblPr>
+        <w:tblW w:type="auto" w:w="0"/>
+        <w:tblLayout w:type="fixed"/>
+        <w:tblLook w:firstColumn="1" w:firstRow="1" w:lastColumn="0" w:lastRow="0" w:noHBand="0" w:noVBand="1" w:val="04A0"/>
+      </w:tblPr>
+      <w:tblGrid>
+        <w:gridCol w:w="9360"/>
+      </w:tblGrid>
+      <w:tr>
         <w:tc>
           <w:tcPr>
-            <w:tcW w:type="dxa" w:w="3960"/>
-            <w:vAlign w:val="center"/>
+            <w:tcW w:type="dxa" w:w="9360"/>
+            <w:shd w:fill="EDF5F1"/>
+            <w:tcMar>
+              <w:top w:w="130" w:type="dxa"/>
+              <w:start w:w="160" w:type="dxa"/>
+              <w:bottom w:w="130" w:type="dxa"/>
+              <w:end w:w="160" w:type="dxa"/>
+            </w:tcMar>
           </w:tcPr>
           <w:p>
+            <w:pPr>
+              <w:spacing w:after="0"/>
+            </w:pPr>
+            <w:r>
+              <w:rPr>
+                <w:rFonts w:ascii="Aptos" w:hAnsi="Aptos"/>
+                <w:b/>
+                <w:color w:val="0F513A"/>
+                <w:sz w:val="21"/>
+              </w:rPr>
+              <w:t xml:space="preserve">Access rule: </w:t>
+            </w:r>
             <w:r>
               <w:rPr>
                 <w:rFonts w:ascii="Aptos" w:hAnsi="Aptos"/>
                 <w:b w:val="0"/>
-                <w:sz w:val="18"/>
+                <w:color w:val="1B2420"/>
+                <w:sz w:val="21"/>
               </w:rPr>
-              <w:t>Full Admin workspace</w:t>
+              <w:t>A customer account is not a Staff account. Staff members must sign in at /admin with their assigned staff credentials.</w:t>
             </w:r>
           </w:p>
         </w:tc>
@@ -492,59 +478,8 @@
     </w:tbl>
     <w:p>
       <w:pPr>
-        <w:pStyle w:val="Heading2"/>
+        <w:spacing w:after="20"/>
       </w:pPr>
-      <w:r>
-        <w:t>Sign-In Addresses</w:t>
-      </w:r>
-    </w:p>
-    <w:p>
-      <w:pPr>
-        <w:pStyle w:val="ListBullet"/>
-      </w:pPr>
-      <w:r>
-        <w:t>Customers: select Sign In on the public website.</w:t>
-      </w:r>
-    </w:p>
-    <w:p>
-      <w:pPr>
-        <w:pStyle w:val="ListBullet"/>
-      </w:pPr>
-      <w:r>
-        <w:t>Staff, Supervisors, Managers, and Owners: open the Staff Admin link in the website footer or go to /admin.</w:t>
-      </w:r>
-    </w:p>
-    <w:p>
-      <w:pPr>
-        <w:pStyle w:val="ListBullet"/>
-      </w:pPr>
-      <w:r>
-        <w:t>Customer accounts cannot enter the Admin workspace. Staff accounts cannot use customer-only account pages as a customer identity.</w:t>
-      </w:r>
-    </w:p>
-    <w:p>
-      <w:pPr>
-        <w:spacing w:before="100" w:after="160" w:line="269" w:lineRule="auto"/>
-        <w:ind w:left="173" w:right="173"/>
-        <w:shd w:fill="FFF4CC"/>
-      </w:pPr>
-      <w:r>
-        <w:rPr>
-          <w:rFonts w:ascii="Aptos" w:hAnsi="Aptos"/>
-          <w:b/>
-          <w:color w:val="7A5A00"/>
-          <w:sz w:val="20"/>
-        </w:rPr>
-        <w:t xml:space="preserve">First staff sign-in: </w:t>
-      </w:r>
-      <w:r>
-        <w:rPr>
-          <w:rFonts w:ascii="Aptos" w:hAnsi="Aptos"/>
-          <w:color w:val="1B2420"/>
-          <w:sz w:val="20"/>
-        </w:rPr>
-        <w:t>If you receive a temporary password, change it when prompted. Until the password is changed, access is limited to My Account.</w:t>
-      </w:r>
     </w:p>
     <w:p>
       <w:r>
@@ -576,10 +511,9 @@
     <w:p>
       <w:pPr>
         <w:pStyle w:val="Subtitle"/>
-        <w:spacing w:after="240"/>
       </w:pPr>
       <w:r>
-        <w:t>Order online, manage your membership, and follow your order status.</w:t>
+        <w:t>Browse the menu, place an order, follow its status, and use member benefits.</w:t>
       </w:r>
     </w:p>
     <w:p>
@@ -587,279 +521,242 @@
         <w:pStyle w:val="Heading2"/>
       </w:pPr>
       <w:r>
-        <w:t>Browse and Search the Menu</w:t>
+        <w:t>Browse and Customize an Order</w:t>
+      </w:r>
+    </w:p>
+    <w:p>
+      <w:pPr>
+        <w:spacing w:before="100" w:after="60"/>
+        <w:jc w:val="center"/>
+      </w:pPr>
+      <w:r>
+        <w:drawing>
+          <wp:inline xmlns:a="http://schemas.openxmlformats.org/drawingml/2006/main" xmlns:pic="http://schemas.openxmlformats.org/drawingml/2006/picture">
+            <wp:extent cx="5806440" cy="2949547"/>
+            <wp:docPr id="1" name="Picture 1" descr="LEVIEN menu with search, categories, product cards, badges, prices, and add buttons" title="Figure 1. Menu search, category filters, product cards, and add buttons."/>
+            <wp:cNvGraphicFramePr>
+              <a:graphicFrameLocks noChangeAspect="1"/>
+            </wp:cNvGraphicFramePr>
+            <a:graphic>
+              <a:graphicData uri="http://schemas.openxmlformats.org/drawingml/2006/picture">
+                <pic:pic>
+                  <pic:nvPicPr>
+                    <pic:cNvPr id="0" name="codex-clipboard-646c475b-bc9b-4787-b38e-e3a460a15d92.png"/>
+                    <pic:cNvPicPr/>
+                  </pic:nvPicPr>
+                  <pic:blipFill>
+                    <a:blip r:embed="rId11"/>
+                    <a:stretch>
+                      <a:fillRect/>
+                    </a:stretch>
+                  </pic:blipFill>
+                  <pic:spPr>
+                    <a:xfrm>
+                      <a:off x="0" y="0"/>
+                      <a:ext cx="5806440" cy="2949547"/>
+                    </a:xfrm>
+                    <a:prstGeom prst="rect"/>
+                  </pic:spPr>
+                </pic:pic>
+              </a:graphicData>
+            </a:graphic>
+          </wp:inline>
+        </w:drawing>
+      </w:r>
+    </w:p>
+    <w:p>
+      <w:pPr>
+        <w:spacing w:after="160"/>
+        <w:jc w:val="center"/>
+      </w:pPr>
+      <w:r>
+        <w:rPr>
+          <w:rFonts w:ascii="Aptos" w:hAnsi="Aptos"/>
+          <w:b w:val="0"/>
+          <w:i/>
+          <w:color w:val="66756E"/>
+          <w:sz w:val="18"/>
+        </w:rPr>
+        <w:t>Figure 1. Menu search, category filters, product cards, and add buttons.</w:t>
       </w:r>
     </w:p>
     <w:p>
       <w:pPr>
         <w:pStyle w:val="ListNumber"/>
+        <w:spacing w:after="80"/>
       </w:pPr>
       <w:r>
-        <w:t>Open Menu from the website header.</w:t>
+        <w:t>Open Menu. Use Search or select a category such as Vietnamese Coffee or Bánh Mì.</w:t>
       </w:r>
     </w:p>
     <w:p>
       <w:pPr>
         <w:pStyle w:val="ListNumber"/>
+        <w:spacing w:after="80"/>
       </w:pPr>
       <w:r>
-        <w:t>Use the search field to enter a product name or keyword.</w:t>
+        <w:t>Select the plus button or Customize &amp; Add. Choose ice, sugar, and eligible toppings.</w:t>
       </w:r>
     </w:p>
     <w:p>
       <w:pPr>
         <w:pStyle w:val="ListNumber"/>
+        <w:spacing w:after="80"/>
       </w:pPr>
       <w:r>
-        <w:t>Select a category to narrow the list. Select All to return to the full menu.</w:t>
+        <w:t>Review the calculated total, choose quantity, then select Add to Order.</w:t>
       </w:r>
     </w:p>
     <w:p>
       <w:pPr>
         <w:pStyle w:val="ListNumber"/>
+        <w:spacing w:after="80"/>
       </w:pPr>
       <w:r>
-        <w:t>Open a product to review options, price, and availability.</w:t>
+        <w:t>Open My Order, review every line, and continue to checkout.</w:t>
       </w:r>
     </w:p>
+    <w:tbl>
+      <w:tblPr>
+        <w:tblW w:type="auto" w:w="0"/>
+        <w:tblLayout w:type="fixed"/>
+        <w:tblLook w:firstColumn="1" w:firstRow="1" w:lastColumn="0" w:lastRow="0" w:noHBand="0" w:noVBand="1" w:val="04A0"/>
+      </w:tblPr>
+      <w:tblGrid>
+        <w:gridCol w:w="9360"/>
+      </w:tblGrid>
+      <w:tr>
+        <w:tc>
+          <w:tcPr>
+            <w:tcW w:type="dxa" w:w="9360"/>
+            <w:shd w:fill="EDF5F1"/>
+            <w:tcMar>
+              <w:top w:w="130" w:type="dxa"/>
+              <w:start w:w="160" w:type="dxa"/>
+              <w:bottom w:w="130" w:type="dxa"/>
+              <w:end w:w="160" w:type="dxa"/>
+            </w:tcMar>
+          </w:tcPr>
+          <w:p>
+            <w:pPr>
+              <w:spacing w:after="0"/>
+            </w:pPr>
+            <w:r>
+              <w:rPr>
+                <w:rFonts w:ascii="Aptos" w:hAnsi="Aptos"/>
+                <w:b/>
+                <w:color w:val="0F513A"/>
+                <w:sz w:val="21"/>
+              </w:rPr>
+              <w:t xml:space="preserve">Combo visibility: </w:t>
+            </w:r>
+            <w:r>
+              <w:rPr>
+                <w:rFonts w:ascii="Aptos" w:hAnsi="Aptos"/>
+                <w:b w:val="0"/>
+                <w:color w:val="1B2420"/>
+                <w:sz w:val="21"/>
+              </w:rPr>
+              <w:t>The Combos link and combo section appear only when at least one combo is active. Use Previous and Next to review active combos.</w:t>
+            </w:r>
+          </w:p>
+        </w:tc>
+      </w:tr>
+    </w:tbl>
     <w:p>
       <w:pPr>
-        <w:spacing w:before="100" w:after="160" w:line="269" w:lineRule="auto"/>
-        <w:ind w:left="173" w:right="173"/>
-        <w:shd w:fill="EDF5F1"/>
+        <w:spacing w:after="20"/>
       </w:pPr>
-      <w:r>
-        <w:rPr>
-          <w:rFonts w:ascii="Aptos" w:hAnsi="Aptos"/>
-          <w:b/>
-          <w:color w:val="0F513A"/>
-          <w:sz w:val="20"/>
-        </w:rPr>
-        <w:t xml:space="preserve">Mobile search: </w:t>
-      </w:r>
-      <w:r>
-        <w:rPr>
-          <w:rFonts w:ascii="Aptos" w:hAnsi="Aptos"/>
-          <w:color w:val="1B2420"/>
-          <w:sz w:val="20"/>
-        </w:rPr>
-        <w:t>On a phone, use the search field at the top of the Menu page. The compact header may hide the desktop search field.</w:t>
-      </w:r>
     </w:p>
     <w:p>
       <w:pPr>
         <w:pStyle w:val="Heading2"/>
       </w:pPr>
       <w:r>
-        <w:t>Add Products and Combos</w:t>
+        <w:t>Track an Order</w:t>
+      </w:r>
+    </w:p>
+    <w:p>
+      <w:pPr>
+        <w:spacing w:before="100" w:after="60"/>
+        <w:jc w:val="center"/>
+      </w:pPr>
+      <w:r>
+        <w:drawing>
+          <wp:inline xmlns:a="http://schemas.openxmlformats.org/drawingml/2006/main" xmlns:pic="http://schemas.openxmlformats.org/drawingml/2006/picture">
+            <wp:extent cx="5806440" cy="3595078"/>
+            <wp:docPr id="2" name="Picture 2" descr="Order tracking page showing received, preparing, ready, and completed stages" title="Figure 2. Live order progress from received through completed."/>
+            <wp:cNvGraphicFramePr>
+              <a:graphicFrameLocks noChangeAspect="1"/>
+            </wp:cNvGraphicFramePr>
+            <a:graphic>
+              <a:graphicData uri="http://schemas.openxmlformats.org/drawingml/2006/picture">
+                <pic:pic>
+                  <pic:nvPicPr>
+                    <pic:cNvPr id="0" name="codex-clipboard-e7aea330-ea3a-4957-9e0d-95a9dd809913.png"/>
+                    <pic:cNvPicPr/>
+                  </pic:nvPicPr>
+                  <pic:blipFill>
+                    <a:blip r:embed="rId12"/>
+                    <a:stretch>
+                      <a:fillRect/>
+                    </a:stretch>
+                  </pic:blipFill>
+                  <pic:spPr>
+                    <a:xfrm>
+                      <a:off x="0" y="0"/>
+                      <a:ext cx="5806440" cy="3595078"/>
+                    </a:xfrm>
+                    <a:prstGeom prst="rect"/>
+                  </pic:spPr>
+                </pic:pic>
+              </a:graphicData>
+            </a:graphic>
+          </wp:inline>
+        </w:drawing>
+      </w:r>
+    </w:p>
+    <w:p>
+      <w:pPr>
+        <w:spacing w:after="160"/>
+        <w:jc w:val="center"/>
+      </w:pPr>
+      <w:r>
+        <w:rPr>
+          <w:rFonts w:ascii="Aptos" w:hAnsi="Aptos"/>
+          <w:b w:val="0"/>
+          <w:i/>
+          <w:color w:val="66756E"/>
+          <w:sz w:val="18"/>
+        </w:rPr>
+        <w:t>Figure 2. Live order progress from received through completed.</w:t>
       </w:r>
     </w:p>
     <w:p>
       <w:pPr>
         <w:pStyle w:val="ListNumber"/>
+        <w:spacing w:after="80"/>
       </w:pPr>
       <w:r>
-        <w:t>Select Add to Order for a product without options, or Customize &amp; Add when options are available.</w:t>
+        <w:t>Open My Order or the tracking link from the confirmation page.</w:t>
       </w:r>
     </w:p>
     <w:p>
       <w:pPr>
         <w:pStyle w:val="ListNumber"/>
+        <w:spacing w:after="80"/>
       </w:pPr>
       <w:r>
-        <w:t>Choose available ice, sugar, topping, quantity, and note options.</w:t>
+        <w:t>Use the main navigation to return to Home or Menu at any time.</w:t>
       </w:r>
     </w:p>
     <w:p>
       <w:pPr>
         <w:pStyle w:val="ListNumber"/>
+        <w:spacing w:after="80"/>
       </w:pPr>
       <w:r>
-        <w:t>For a combo, use Previous or Next to choose the offer, then select Customize Combo.</w:t>
-      </w:r>
-    </w:p>
-    <w:p>
-      <w:pPr>
-        <w:pStyle w:val="ListNumber"/>
-      </w:pPr>
-      <w:r>
-        <w:t>Review My Order and adjust quantities or remove items before checkout.</w:t>
-      </w:r>
-    </w:p>
-    <w:p>
-      <w:pPr>
-        <w:spacing w:before="100" w:after="160" w:line="269" w:lineRule="auto"/>
-        <w:ind w:left="173" w:right="173"/>
-        <w:shd w:fill="FFF4CC"/>
-      </w:pPr>
-      <w:r>
-        <w:rPr>
-          <w:rFonts w:ascii="Aptos" w:hAnsi="Aptos"/>
-          <w:b/>
-          <w:color w:val="7A5A00"/>
-          <w:sz w:val="20"/>
-        </w:rPr>
-        <w:t xml:space="preserve">Availability: </w:t>
-      </w:r>
-      <w:r>
-        <w:rPr>
-          <w:rFonts w:ascii="Aptos" w:hAnsi="Aptos"/>
-          <w:color w:val="1B2420"/>
-          <w:sz w:val="20"/>
-        </w:rPr>
-        <w:t>A sold-out product or a combo containing a sold-out item cannot be added until the store makes it available again.</w:t>
-      </w:r>
-    </w:p>
-    <w:p>
-      <w:pPr>
-        <w:pStyle w:val="Heading2"/>
-      </w:pPr>
-      <w:r>
-        <w:t>Checkout and Track an Order</w:t>
-      </w:r>
-    </w:p>
-    <w:p>
-      <w:pPr>
-        <w:pStyle w:val="ListNumber"/>
-      </w:pPr>
-      <w:r>
-        <w:t>Open My Order and select Continue to Checkout.</w:t>
-      </w:r>
-    </w:p>
-    <w:p>
-      <w:pPr>
-        <w:pStyle w:val="ListNumber"/>
-      </w:pPr>
-      <w:r>
-        <w:t>Choose pickup or the available fulfillment method, then provide the requested contact and payment details.</w:t>
-      </w:r>
-    </w:p>
-    <w:p>
-      <w:pPr>
-        <w:pStyle w:val="ListNumber"/>
-      </w:pPr>
-      <w:r>
-        <w:t>Submit the order once. Keep the confirmation page or order number.</w:t>
-      </w:r>
-    </w:p>
-    <w:p>
-      <w:pPr>
-        <w:pStyle w:val="ListNumber"/>
-      </w:pPr>
-      <w:r>
-        <w:t>Open My Order or the tracking link to view Order received, Preparing, Ready, and Completed.</w:t>
-      </w:r>
-    </w:p>
-    <w:p>
-      <w:pPr>
-        <w:pStyle w:val="ListNumber"/>
-      </w:pPr>
-      <w:r>
-        <w:t>Use Home, Menu, or the return action after checking status to continue browsing the customer website.</w:t>
-      </w:r>
-    </w:p>
-    <w:p>
-      <w:pPr>
-        <w:spacing w:before="100" w:after="160" w:line="269" w:lineRule="auto"/>
-        <w:ind w:left="173" w:right="173"/>
-        <w:shd w:fill="FFF4CC"/>
-      </w:pPr>
-      <w:r>
-        <w:rPr>
-          <w:rFonts w:ascii="Aptos" w:hAnsi="Aptos"/>
-          <w:b/>
-          <w:color w:val="7A5A00"/>
-          <w:sz w:val="20"/>
-        </w:rPr>
-        <w:t xml:space="preserve">Completed orders: </w:t>
-      </w:r>
-      <w:r>
-        <w:rPr>
-          <w:rFonts w:ascii="Aptos" w:hAnsi="Aptos"/>
-          <w:color w:val="1B2420"/>
-          <w:sz w:val="20"/>
-        </w:rPr>
-        <w:t>Completed is final. Store staff cannot move a completed order back to an earlier status.</w:t>
-      </w:r>
-    </w:p>
-    <w:p>
-      <w:pPr>
-        <w:pStyle w:val="Heading2"/>
-      </w:pPr>
-      <w:r>
-        <w:t>Customer Account and Membership</w:t>
-      </w:r>
-    </w:p>
-    <w:p>
-      <w:pPr>
-        <w:pStyle w:val="ListNumber"/>
-      </w:pPr>
-      <w:r>
-        <w:t>Select Sign In and enter your customer email and password.</w:t>
-      </w:r>
-    </w:p>
-    <w:p>
-      <w:pPr>
-        <w:pStyle w:val="ListNumber"/>
-      </w:pPr>
-      <w:r>
-        <w:t>Open My Account to review orders, rewards, profile information, and gift cards.</w:t>
-      </w:r>
-    </w:p>
-    <w:p>
-      <w:pPr>
-        <w:pStyle w:val="ListNumber"/>
-      </w:pPr>
-      <w:r>
-        <w:t>Open View Member Card to display your member number or QR code at the counter.</w:t>
-      </w:r>
-    </w:p>
-    <w:p>
-      <w:pPr>
-        <w:pStyle w:val="ListNumber"/>
-      </w:pPr>
-      <w:r>
-        <w:t>Update your profile details and save the changes.</w:t>
-      </w:r>
-    </w:p>
-    <w:p>
-      <w:pPr>
-        <w:pStyle w:val="Heading2"/>
-      </w:pPr>
-      <w:r>
-        <w:t>Rewards and Gift Cards</w:t>
-      </w:r>
-    </w:p>
-    <w:p>
-      <w:pPr>
-        <w:pStyle w:val="ListBullet"/>
-      </w:pPr>
-      <w:r>
-        <w:t>Rewards appear after the qualifying purchase conditions are met.</w:t>
-      </w:r>
-    </w:p>
-    <w:p>
-      <w:pPr>
-        <w:pStyle w:val="ListBullet"/>
-      </w:pPr>
-      <w:r>
-        <w:t>At checkout, select an available reward only when an eligible product is in the order.</w:t>
-      </w:r>
-    </w:p>
-    <w:p>
-      <w:pPr>
-        <w:pStyle w:val="ListBullet"/>
-      </w:pPr>
-      <w:r>
-        <w:t>Gift cards purchased online appear in My Account after successful payment and delivery processing.</w:t>
-      </w:r>
-    </w:p>
-    <w:p>
-      <w:pPr>
-        <w:pStyle w:val="ListBullet"/>
-      </w:pPr>
-      <w:r>
-        <w:t>A physical gift is fulfilled by staff at the counter when it appears in the store fulfillment queue.</w:t>
+        <w:t>Completed is the final status. A completed order cannot be moved backward.</w:t>
       </w:r>
     </w:p>
     <w:p>
@@ -892,10 +789,9 @@
     <w:p>
       <w:pPr>
         <w:pStyle w:val="Subtitle"/>
-        <w:spacing w:after="240"/>
       </w:pPr>
       <w:r>
-        <w:t>Handle daily orders and member service, and manage your own work schedule.</w:t>
+        <w:t>Handle customer orders and member service, then manage your own availability and published shifts.</w:t>
       </w:r>
     </w:p>
     <w:p>
@@ -903,39 +799,99 @@
         <w:pStyle w:val="Heading2"/>
       </w:pPr>
       <w:r>
-        <w:t>Start Your Shift</w:t>
+        <w:t>My Workspace and Availability</w:t>
+      </w:r>
+    </w:p>
+    <w:p>
+      <w:pPr>
+        <w:spacing w:before="100" w:after="60"/>
+        <w:jc w:val="center"/>
+      </w:pPr>
+      <w:r>
+        <w:drawing>
+          <wp:inline xmlns:a="http://schemas.openxmlformats.org/drawingml/2006/main" xmlns:pic="http://schemas.openxmlformats.org/drawingml/2006/picture">
+            <wp:extent cx="5806440" cy="2869849"/>
+            <wp:docPr id="3" name="Picture 3" descr="Staff workspace showing register availability button, shift metrics, and upcoming shifts" title="Figure 3. Staff workspace with upcoming shifts and Register availability."/>
+            <wp:cNvGraphicFramePr>
+              <a:graphicFrameLocks noChangeAspect="1"/>
+            </wp:cNvGraphicFramePr>
+            <a:graphic>
+              <a:graphicData uri="http://schemas.openxmlformats.org/drawingml/2006/picture">
+                <pic:pic>
+                  <pic:nvPicPr>
+                    <pic:cNvPr id="0" name="codex-clipboard-287b2c27-b35e-4e68-82a4-a05a2e9ad35c.png"/>
+                    <pic:cNvPicPr/>
+                  </pic:nvPicPr>
+                  <pic:blipFill>
+                    <a:blip r:embed="rId13"/>
+                    <a:stretch>
+                      <a:fillRect/>
+                    </a:stretch>
+                  </pic:blipFill>
+                  <pic:spPr>
+                    <a:xfrm>
+                      <a:off x="0" y="0"/>
+                      <a:ext cx="5806440" cy="2869849"/>
+                    </a:xfrm>
+                    <a:prstGeom prst="rect"/>
+                  </pic:spPr>
+                </pic:pic>
+              </a:graphicData>
+            </a:graphic>
+          </wp:inline>
+        </w:drawing>
+      </w:r>
+    </w:p>
+    <w:p>
+      <w:pPr>
+        <w:spacing w:after="160"/>
+        <w:jc w:val="center"/>
+      </w:pPr>
+      <w:r>
+        <w:rPr>
+          <w:rFonts w:ascii="Aptos" w:hAnsi="Aptos"/>
+          <w:b w:val="0"/>
+          <w:i/>
+          <w:color w:val="66756E"/>
+          <w:sz w:val="18"/>
+        </w:rPr>
+        <w:t>Figure 3. Staff workspace with upcoming shifts and Register availability.</w:t>
       </w:r>
     </w:p>
     <w:p>
       <w:pPr>
         <w:pStyle w:val="ListNumber"/>
+        <w:spacing w:after="80"/>
       </w:pPr>
       <w:r>
-        <w:t>Sign in at /admin using your staff email.</w:t>
+        <w:t>Open My Workspace to review upcoming published shifts and unread updates.</w:t>
       </w:r>
     </w:p>
     <w:p>
       <w:pPr>
         <w:pStyle w:val="ListNumber"/>
+        <w:spacing w:after="80"/>
       </w:pPr>
       <w:r>
-        <w:t>Change a temporary password if prompted.</w:t>
+        <w:t>Select Register availability, enter the preferred date and time, and submit.</w:t>
       </w:r>
     </w:p>
     <w:p>
       <w:pPr>
         <w:pStyle w:val="ListNumber"/>
+        <w:spacing w:after="80"/>
       </w:pPr>
       <w:r>
-        <w:t>Open My Workspace to review upcoming shifts, scheduled hours, updates, and time-off status.</w:t>
+        <w:t>Availability is a request, not a published shift. Wait for Manager approval or assignment.</w:t>
       </w:r>
     </w:p>
     <w:p>
       <w:pPr>
         <w:pStyle w:val="ListNumber"/>
+        <w:spacing w:after="80"/>
       </w:pPr>
       <w:r>
-        <w:t>Open My Account to upload or replace your profile photo.</w:t>
+        <w:t>Open Time Off for leave requests; the existing time-off workflow remains separate.</w:t>
       </w:r>
     </w:p>
     <w:p>
@@ -943,207 +899,43 @@
         <w:pStyle w:val="Heading2"/>
       </w:pPr>
       <w:r>
-        <w:t>Manage Customer Orders</w:t>
+        <w:t>Orders and Member Service</w:t>
       </w:r>
     </w:p>
     <w:p>
       <w:pPr>
         <w:pStyle w:val="ListNumber"/>
+        <w:spacing w:after="80"/>
       </w:pPr>
       <w:r>
-        <w:t>Open Orders and use the status tabs to find New, Preparing, Ready, or Completed orders.</w:t>
+        <w:t>Open Orders to view online and counter orders in one queue.</w:t>
       </w:r>
     </w:p>
     <w:p>
       <w:pPr>
         <w:pStyle w:val="ListNumber"/>
+        <w:spacing w:after="80"/>
       </w:pPr>
       <w:r>
-        <w:t>Open View to confirm customer, fulfillment type, items, notes, and payment status.</w:t>
+        <w:t>Move an order through New, Preparing, Ready, and Completed. Completed becomes locked.</w:t>
       </w:r>
     </w:p>
     <w:p>
       <w:pPr>
         <w:pStyle w:val="ListNumber"/>
+        <w:spacing w:after="80"/>
       </w:pPr>
       <w:r>
-        <w:t>Move the order forward as work progresses: New to Preparing, then Ready, then Completed.</w:t>
+        <w:t>Use Create Counter Order for walk-in sales. Select products, toppings, customer, and tender.</w:t>
       </w:r>
     </w:p>
     <w:p>
       <w:pPr>
         <w:pStyle w:val="ListNumber"/>
+        <w:spacing w:after="80"/>
       </w:pPr>
       <w:r>
-        <w:t>Do not mark an order Completed until it has been handed to the customer or fully fulfilled.</w:t>
-      </w:r>
-    </w:p>
-    <w:p>
-      <w:pPr>
-        <w:spacing w:before="100" w:after="160" w:line="269" w:lineRule="auto"/>
-        <w:ind w:left="173" w:right="173"/>
-        <w:shd w:fill="FFF4CC"/>
-      </w:pPr>
-      <w:r>
-        <w:rPr>
-          <w:rFonts w:ascii="Aptos" w:hAnsi="Aptos"/>
-          <w:b/>
-          <w:color w:val="7A5A00"/>
-          <w:sz w:val="20"/>
-        </w:rPr>
-        <w:t xml:space="preserve">Final status: </w:t>
-      </w:r>
-      <w:r>
-        <w:rPr>
-          <w:rFonts w:ascii="Aptos" w:hAnsi="Aptos"/>
-          <w:color w:val="1B2420"/>
-          <w:sz w:val="20"/>
-        </w:rPr>
-        <w:t>After an order is Completed, the status is locked and cannot be changed.</w:t>
-      </w:r>
-    </w:p>
-    <w:p>
-      <w:pPr>
-        <w:pStyle w:val="Heading2"/>
-      </w:pPr>
-      <w:r>
-        <w:t>Create a Counter Order</w:t>
-      </w:r>
-    </w:p>
-    <w:p>
-      <w:pPr>
-        <w:pStyle w:val="ListNumber"/>
-      </w:pPr>
-      <w:r>
-        <w:t>Open Orders and select Create Counter Order.</w:t>
-      </w:r>
-    </w:p>
-    <w:p>
-      <w:pPr>
-        <w:pStyle w:val="ListNumber"/>
-      </w:pPr>
-      <w:r>
-        <w:t>Choose a member or keep Guest customer selected and enter the guest details.</w:t>
-      </w:r>
-    </w:p>
-    <w:p>
-      <w:pPr>
-        <w:pStyle w:val="ListNumber"/>
-      </w:pPr>
-      <w:r>
-        <w:t>Search for products, add quantities and available options, then choose the payment method.</w:t>
-      </w:r>
-    </w:p>
-    <w:p>
-      <w:pPr>
-        <w:pStyle w:val="ListNumber"/>
-      </w:pPr>
-      <w:r>
-        <w:t>Review the estimated total and select Place Counter Order.</w:t>
-      </w:r>
-    </w:p>
-    <w:p>
-      <w:pPr>
-        <w:pStyle w:val="Heading2"/>
-      </w:pPr>
-      <w:r>
-        <w:t>Find and Serve a Member</w:t>
-      </w:r>
-    </w:p>
-    <w:p>
-      <w:pPr>
-        <w:pStyle w:val="ListNumber"/>
-      </w:pPr>
-      <w:r>
-        <w:t>Open Scan Member.</w:t>
-      </w:r>
-    </w:p>
-    <w:p>
-      <w:pPr>
-        <w:pStyle w:val="ListNumber"/>
-      </w:pPr>
-      <w:r>
-        <w:t>Scan the member QR code, enter the member number, or enter the member phone number.</w:t>
-      </w:r>
-    </w:p>
-    <w:p>
-      <w:pPr>
-        <w:pStyle w:val="ListNumber"/>
-      </w:pPr>
-      <w:r>
-        <w:t>Confirm the member name and contact details before applying a reward.</w:t>
-      </w:r>
-    </w:p>
-    <w:p>
-      <w:pPr>
-        <w:pStyle w:val="ListNumber"/>
-      </w:pPr>
-      <w:r>
-        <w:t>Redeem only a reward the customer has chosen and is eligible to use.</w:t>
-      </w:r>
-    </w:p>
-    <w:p>
-      <w:pPr>
-        <w:pStyle w:val="Heading2"/>
-      </w:pPr>
-      <w:r>
-        <w:t>Register Availability and Request Time Off</w:t>
-      </w:r>
-    </w:p>
-    <w:p>
-      <w:pPr>
-        <w:pStyle w:val="ListNumber"/>
-      </w:pPr>
-      <w:r>
-        <w:t>Open My Workspace or Schedule and select Register My Shift / Offer a Shift.</w:t>
-      </w:r>
-    </w:p>
-    <w:p>
-      <w:pPr>
-        <w:pStyle w:val="ListNumber"/>
-      </w:pPr>
-      <w:r>
-        <w:t>Submit the dates and times when you are available. This is a request, not a published shift.</w:t>
-      </w:r>
-    </w:p>
-    <w:p>
-      <w:pPr>
-        <w:pStyle w:val="ListNumber"/>
-      </w:pPr>
-      <w:r>
-        <w:t>Review the published schedule to confirm the shifts assigned by a manager.</w:t>
-      </w:r>
-    </w:p>
-    <w:p>
-      <w:pPr>
-        <w:pStyle w:val="ListNumber"/>
-      </w:pPr>
-      <w:r>
-        <w:t>Open Time Off to submit a leave request and monitor its approval status.</w:t>
-      </w:r>
-    </w:p>
-    <w:p>
-      <w:pPr>
-        <w:spacing w:before="100" w:after="160" w:line="269" w:lineRule="auto"/>
-        <w:ind w:left="173" w:right="173"/>
-        <w:shd w:fill="EDF5F1"/>
-      </w:pPr>
-      <w:r>
-        <w:rPr>
-          <w:rFonts w:ascii="Aptos" w:hAnsi="Aptos"/>
-          <w:b/>
-          <w:color w:val="0F513A"/>
-          <w:sz w:val="20"/>
-        </w:rPr>
-        <w:t xml:space="preserve">Scheduling rule: </w:t>
-      </w:r>
-      <w:r>
-        <w:rPr>
-          <w:rFonts w:ascii="Aptos" w:hAnsi="Aptos"/>
-          <w:color w:val="1B2420"/>
-          <w:sz w:val="20"/>
-        </w:rPr>
-        <w:t>Several employees may register the same availability. A manager decides which employee is assigned and publishes the final schedule.</w:t>
+        <w:t>Use Scan Member to search by QR code, member number, or phone number.</w:t>
       </w:r>
     </w:p>
     <w:p>
@@ -1176,87 +968,101 @@
     <w:p>
       <w:pPr>
         <w:pStyle w:val="Subtitle"/>
-        <w:spacing w:after="240"/>
       </w:pPr>
       <w:r>
-        <w:t>Support the floor team while using the same protected operational tools as Staff.</w:t>
-      </w:r>
-    </w:p>
-    <w:p>
-      <w:r>
-        <w:t>Supervisors can perform the Staff workflows in this guide and can oversee the active order queue. Their access is intentionally smaller than Manager access.</w:t>
+        <w:t>Use Staff workflows and help keep the live order queue moving during a shift.</w:t>
       </w:r>
     </w:p>
     <w:p>
       <w:pPr>
-        <w:pStyle w:val="Heading2"/>
+        <w:spacing w:before="100" w:after="60"/>
+        <w:jc w:val="center"/>
       </w:pPr>
       <w:r>
-        <w:t>Supervisor Priorities</w:t>
+        <w:drawing>
+          <wp:inline xmlns:a="http://schemas.openxmlformats.org/drawingml/2006/main" xmlns:pic="http://schemas.openxmlformats.org/drawingml/2006/picture">
+            <wp:extent cx="5806440" cy="1491531"/>
+            <wp:docPr id="4" name="Picture 4" descr="Admin orders page with filters, order queue, TV display link, and create counter order button" title="Figure 4. Unified order queue, status filters, TV display, and counter-order entry."/>
+            <wp:cNvGraphicFramePr>
+              <a:graphicFrameLocks noChangeAspect="1"/>
+            </wp:cNvGraphicFramePr>
+            <a:graphic>
+              <a:graphicData uri="http://schemas.openxmlformats.org/drawingml/2006/picture">
+                <pic:pic>
+                  <pic:nvPicPr>
+                    <pic:cNvPr id="0" name="codex-clipboard-b76521af-7770-4cf4-9913-695ec4d7cdfb.png"/>
+                    <pic:cNvPicPr/>
+                  </pic:nvPicPr>
+                  <pic:blipFill>
+                    <a:blip r:embed="rId14"/>
+                    <a:stretch>
+                      <a:fillRect/>
+                    </a:stretch>
+                  </pic:blipFill>
+                  <pic:spPr>
+                    <a:xfrm>
+                      <a:off x="0" y="0"/>
+                      <a:ext cx="5806440" cy="1491531"/>
+                    </a:xfrm>
+                    <a:prstGeom prst="rect"/>
+                  </pic:spPr>
+                </pic:pic>
+              </a:graphicData>
+            </a:graphic>
+          </wp:inline>
+        </w:drawing>
       </w:r>
     </w:p>
     <w:p>
       <w:pPr>
-        <w:pStyle w:val="ListBullet"/>
+        <w:spacing w:after="160"/>
+        <w:jc w:val="center"/>
       </w:pPr>
       <w:r>
-        <w:t>Keep the order queue moving and verify that status changes match actual progress.</w:t>
-      </w:r>
-    </w:p>
-    <w:p>
-      <w:pPr>
-        <w:pStyle w:val="ListBullet"/>
-      </w:pPr>
-      <w:r>
-        <w:t>Help staff locate members and understand available rewards without changing loyalty rules.</w:t>
-      </w:r>
-    </w:p>
-    <w:p>
-      <w:pPr>
-        <w:pStyle w:val="ListBullet"/>
-      </w:pPr>
-      <w:r>
-        <w:t>Review your own schedule and availability; final schedule publishing remains a Manager or Owner task.</w:t>
-      </w:r>
-    </w:p>
-    <w:p>
-      <w:pPr>
-        <w:pStyle w:val="ListBullet"/>
-      </w:pPr>
-      <w:r>
-        <w:t>Escalate catalog, employee, compensation, loyalty-program, and report changes to a Manager or Owner.</w:t>
-      </w:r>
-    </w:p>
-    <w:p>
-      <w:pPr>
-        <w:pStyle w:val="Heading2"/>
-      </w:pPr>
-      <w:r>
-        <w:t>End-of-Shift Check</w:t>
+        <w:rPr>
+          <w:rFonts w:ascii="Aptos" w:hAnsi="Aptos"/>
+          <w:b w:val="0"/>
+          <w:i/>
+          <w:color w:val="66756E"/>
+          <w:sz w:val="18"/>
+        </w:rPr>
+        <w:t>Figure 4. Unified order queue, status filters, TV display, and counter-order entry.</w:t>
       </w:r>
     </w:p>
     <w:p>
       <w:pPr>
         <w:pStyle w:val="ListNumber"/>
+        <w:spacing w:after="80"/>
       </w:pPr>
       <w:r>
-        <w:t>Review New, Preparing, and Ready tabs for unfinished orders.</w:t>
+        <w:t>Use the status filters to focus on New, Preparing, Ready, or Completed orders.</w:t>
       </w:r>
     </w:p>
     <w:p>
       <w:pPr>
         <w:pStyle w:val="ListNumber"/>
+        <w:spacing w:after="80"/>
       </w:pPr>
       <w:r>
-        <w:t>Confirm completed pickups are marked Completed only once fulfillment is finished.</w:t>
+        <w:t>Open View to verify order details before changing status.</w:t>
       </w:r>
     </w:p>
     <w:p>
       <w:pPr>
         <w:pStyle w:val="ListNumber"/>
+        <w:spacing w:after="80"/>
       </w:pPr>
       <w:r>
-        <w:t>Report payment, customer, or scheduling exceptions to the Manager.</w:t>
+        <w:t>Use Open TV Display for the customer-facing kitchen or pickup screen.</w:t>
+      </w:r>
+    </w:p>
+    <w:p>
+      <w:pPr>
+        <w:pStyle w:val="ListNumber"/>
+        <w:spacing w:after="80"/>
+      </w:pPr>
+      <w:r>
+        <w:t>Escalate refunds, catalog changes, employee access, or schedule decisions to a Manager.</w:t>
       </w:r>
     </w:p>
     <w:p>
@@ -1289,10 +1095,9 @@
     <w:p>
       <w:pPr>
         <w:pStyle w:val="Subtitle"/>
-        <w:spacing w:after="240"/>
       </w:pPr>
       <w:r>
-        <w:t>Run store operations, publish schedules, maintain the storefront, and review business performance.</w:t>
+        <w:t>Build the team schedule, manage store content, and review operational performance.</w:t>
       </w:r>
     </w:p>
     <w:p>
@@ -1300,31 +1105,108 @@
         <w:pStyle w:val="Heading2"/>
       </w:pPr>
       <w:r>
-        <w:t>Orders and Counter Operations</w:t>
+        <w:t>Create and Publish the Schedule</w:t>
       </w:r>
     </w:p>
     <w:p>
       <w:pPr>
-        <w:pStyle w:val="ListBullet"/>
+        <w:spacing w:before="100" w:after="60"/>
+        <w:jc w:val="center"/>
       </w:pPr>
       <w:r>
-        <w:t>Monitor the live order queue and open the TV Display when the kitchen or pickup area needs a shared status screen.</w:t>
+        <w:drawing>
+          <wp:inline xmlns:a="http://schemas.openxmlformats.org/drawingml/2006/main" xmlns:pic="http://schemas.openxmlformats.org/drawingml/2006/picture">
+            <wp:extent cx="5806440" cy="2739658"/>
+            <wp:docPr id="5" name="Picture 5" descr="Manager add work shift dialog showing employee selection and shift details" title="Figure 5. Add work shift dialog with employee, date, time, station, and note."/>
+            <wp:cNvGraphicFramePr>
+              <a:graphicFrameLocks noChangeAspect="1"/>
+            </wp:cNvGraphicFramePr>
+            <a:graphic>
+              <a:graphicData uri="http://schemas.openxmlformats.org/drawingml/2006/picture">
+                <pic:pic>
+                  <pic:nvPicPr>
+                    <pic:cNvPr id="0" name="codex-clipboard-59b8d039-a622-4df5-9ce5-68f9ad2da0bc.png"/>
+                    <pic:cNvPicPr/>
+                  </pic:nvPicPr>
+                  <pic:blipFill>
+                    <a:blip r:embed="rId15"/>
+                    <a:stretch>
+                      <a:fillRect/>
+                    </a:stretch>
+                  </pic:blipFill>
+                  <pic:spPr>
+                    <a:xfrm>
+                      <a:off x="0" y="0"/>
+                      <a:ext cx="5806440" cy="2739658"/>
+                    </a:xfrm>
+                    <a:prstGeom prst="rect"/>
+                  </pic:spPr>
+                </pic:pic>
+              </a:graphicData>
+            </a:graphic>
+          </wp:inline>
+        </w:drawing>
       </w:r>
     </w:p>
     <w:p>
       <w:pPr>
-        <w:pStyle w:val="ListBullet"/>
+        <w:spacing w:after="160"/>
+        <w:jc w:val="center"/>
       </w:pPr>
       <w:r>
-        <w:t>Create counter orders for walk-in customers and members.</w:t>
+        <w:rPr>
+          <w:rFonts w:ascii="Aptos" w:hAnsi="Aptos"/>
+          <w:b w:val="0"/>
+          <w:i/>
+          <w:color w:val="66756E"/>
+          <w:sz w:val="18"/>
+        </w:rPr>
+        <w:t>Figure 5. Add work shift dialog with employee, date, time, station, and note.</w:t>
       </w:r>
     </w:p>
     <w:p>
       <w:pPr>
-        <w:pStyle w:val="ListBullet"/>
+        <w:pStyle w:val="ListNumber"/>
+        <w:spacing w:after="80"/>
       </w:pPr>
       <w:r>
-        <w:t>Review order details before changing status; Completed remains locked for every role.</w:t>
+        <w:t>Open Schedule. Employee availability requests appear on the weekly board and in Employee requests.</w:t>
+      </w:r>
+    </w:p>
+    <w:p>
+      <w:pPr>
+        <w:pStyle w:val="ListNumber"/>
+        <w:spacing w:after="80"/>
+      </w:pPr>
+      <w:r>
+        <w:t>Select the plus button in the correct employee row and date column. The dialog must keep that employee selected.</w:t>
+      </w:r>
+    </w:p>
+    <w:p>
+      <w:pPr>
+        <w:pStyle w:val="ListNumber"/>
+        <w:spacing w:after="80"/>
+      </w:pPr>
+      <w:r>
+        <w:t>Enter start time, end time, station, and optional note, then select Publish shift.</w:t>
+      </w:r>
+    </w:p>
+    <w:p>
+      <w:pPr>
+        <w:pStyle w:val="ListNumber"/>
+        <w:spacing w:after="80"/>
+      </w:pPr>
+      <w:r>
+        <w:t>Multiple employees may register the same availability. Choose who to schedule; do not auto-approve every request.</w:t>
+      </w:r>
+    </w:p>
+    <w:p>
+      <w:pPr>
+        <w:pStyle w:val="ListNumber"/>
+        <w:spacing w:after="80"/>
+      </w:pPr>
+      <w:r>
+        <w:t>Review approved Time Off before publishing or copying a week.</w:t>
       </w:r>
     </w:p>
     <w:p>
@@ -1332,295 +1214,99 @@
         <w:pStyle w:val="Heading2"/>
       </w:pPr>
       <w:r>
-        <w:t>Build and Publish the Schedule</w:t>
+        <w:t>Catalog and Toppings</w:t>
+      </w:r>
+    </w:p>
+    <w:p>
+      <w:pPr>
+        <w:spacing w:before="100" w:after="60"/>
+        <w:jc w:val="center"/>
+      </w:pPr>
+      <w:r>
+        <w:drawing>
+          <wp:inline xmlns:a="http://schemas.openxmlformats.org/drawingml/2006/main" xmlns:pic="http://schemas.openxmlformats.org/drawingml/2006/picture">
+            <wp:extent cx="5806440" cy="2457858"/>
+            <wp:docPr id="6" name="Picture 6" descr="Admin toppings page listing active toppings with prices and edit controls" title="Figure 6. Topping master data with prices, status, and edit controls."/>
+            <wp:cNvGraphicFramePr>
+              <a:graphicFrameLocks noChangeAspect="1"/>
+            </wp:cNvGraphicFramePr>
+            <a:graphic>
+              <a:graphicData uri="http://schemas.openxmlformats.org/drawingml/2006/picture">
+                <pic:pic>
+                  <pic:nvPicPr>
+                    <pic:cNvPr id="0" name="codex-clipboard-cdd83a96-fc3c-4b8a-96cb-d5a255cc1464.png"/>
+                    <pic:cNvPicPr/>
+                  </pic:nvPicPr>
+                  <pic:blipFill>
+                    <a:blip r:embed="rId16"/>
+                    <a:stretch>
+                      <a:fillRect/>
+                    </a:stretch>
+                  </pic:blipFill>
+                  <pic:spPr>
+                    <a:xfrm>
+                      <a:off x="0" y="0"/>
+                      <a:ext cx="5806440" cy="2457858"/>
+                    </a:xfrm>
+                    <a:prstGeom prst="rect"/>
+                  </pic:spPr>
+                </pic:pic>
+              </a:graphicData>
+            </a:graphic>
+          </wp:inline>
+        </w:drawing>
+      </w:r>
+    </w:p>
+    <w:p>
+      <w:pPr>
+        <w:spacing w:after="160"/>
+        <w:jc w:val="center"/>
+      </w:pPr>
+      <w:r>
+        <w:rPr>
+          <w:rFonts w:ascii="Aptos" w:hAnsi="Aptos"/>
+          <w:b w:val="0"/>
+          <w:i/>
+          <w:color w:val="66756E"/>
+          <w:sz w:val="18"/>
+        </w:rPr>
+        <w:t>Figure 6. Topping master data with prices, status, and edit controls.</w:t>
       </w:r>
     </w:p>
     <w:p>
       <w:pPr>
         <w:pStyle w:val="ListNumber"/>
+        <w:spacing w:after="80"/>
       </w:pPr>
       <w:r>
-        <w:t>Open Schedule and choose the correct week.</w:t>
+        <w:t>Open Products to create or edit menu items and upload product images.</w:t>
       </w:r>
     </w:p>
     <w:p>
       <w:pPr>
         <w:pStyle w:val="ListNumber"/>
+        <w:spacing w:after="80"/>
       </w:pPr>
       <w:r>
-        <w:t>Review employee availability registrations. Multiple employees may request the same time.</w:t>
+        <w:t>Open Toppings to add or edit paid options. Link toppings to eligible products in the product form.</w:t>
       </w:r>
     </w:p>
     <w:p>
       <w:pPr>
         <w:pStyle w:val="ListNumber"/>
+        <w:spacing w:after="80"/>
       </w:pPr>
       <w:r>
-        <w:t>Select the employee row or cell you intend to schedule, then choose Add Work Shift.</w:t>
+        <w:t>Use active, sold-out, category, and badge settings to control storefront visibility.</w:t>
       </w:r>
     </w:p>
     <w:p>
       <w:pPr>
         <w:pStyle w:val="ListNumber"/>
+        <w:spacing w:after="80"/>
       </w:pPr>
       <w:r>
-        <w:t>Confirm the employee, date, start time, end time, station, and manager note.</w:t>
-      </w:r>
-    </w:p>
-    <w:p>
-      <w:pPr>
-        <w:pStyle w:val="ListNumber"/>
-      </w:pPr>
-      <w:r>
-        <w:t>Publish the shift and verify it appears in the weekly schedule and the employee workspace.</w:t>
-      </w:r>
-    </w:p>
-    <w:p>
-      <w:pPr>
-        <w:pStyle w:val="ListNumber"/>
-      </w:pPr>
-      <w:r>
-        <w:t>Use Time Off to approve or decline requests before finalizing coverage.</w:t>
-      </w:r>
-    </w:p>
-    <w:p>
-      <w:pPr>
-        <w:spacing w:before="100" w:after="160" w:line="269" w:lineRule="auto"/>
-        <w:ind w:left="173" w:right="173"/>
-        <w:shd w:fill="FFF4CC"/>
-      </w:pPr>
-      <w:r>
-        <w:rPr>
-          <w:rFonts w:ascii="Aptos" w:hAnsi="Aptos"/>
-          <w:b/>
-          <w:color w:val="7A5A00"/>
-          <w:sz w:val="20"/>
-        </w:rPr>
-        <w:t xml:space="preserve">Employee selection: </w:t>
-      </w:r>
-      <w:r>
-        <w:rPr>
-          <w:rFonts w:ascii="Aptos" w:hAnsi="Aptos"/>
-          <w:color w:val="1B2420"/>
-          <w:sz w:val="20"/>
-        </w:rPr>
-        <w:t>When opening Add Work Shift from an employee row, confirm that employee is selected before publishing.</w:t>
-      </w:r>
-    </w:p>
-    <w:p>
-      <w:pPr>
-        <w:pStyle w:val="Heading2"/>
-      </w:pPr>
-      <w:r>
-        <w:t>Manage Employees</w:t>
-      </w:r>
-    </w:p>
-    <w:p>
-      <w:pPr>
-        <w:pStyle w:val="ListBullet"/>
-      </w:pPr>
-      <w:r>
-        <w:t>Create Staff, Supervisor, Manager, or Owner accounts only for authorized team members.</w:t>
-      </w:r>
-    </w:p>
-    <w:p>
-      <w:pPr>
-        <w:pStyle w:val="ListBullet"/>
-      </w:pPr>
-      <w:r>
-        <w:t>Provide the temporary password privately and require a password change at first sign-in.</w:t>
-      </w:r>
-    </w:p>
-    <w:p>
-      <w:pPr>
-        <w:pStyle w:val="ListBullet"/>
-      </w:pPr>
-      <w:r>
-        <w:t>Update roles, active status, hourly rate, and planned hours when employment details change.</w:t>
-      </w:r>
-    </w:p>
-    <w:p>
-      <w:pPr>
-        <w:pStyle w:val="ListBullet"/>
-      </w:pPr>
-      <w:r>
-        <w:t>Use profile photos only for the employee who owns the account or with their permission.</w:t>
-      </w:r>
-    </w:p>
-    <w:p>
-      <w:pPr>
-        <w:pStyle w:val="Heading2"/>
-      </w:pPr>
-      <w:r>
-        <w:t>Customers, Loyalty, and Gift Cards</w:t>
-      </w:r>
-    </w:p>
-    <w:p>
-      <w:pPr>
-        <w:pStyle w:val="ListBullet"/>
-      </w:pPr>
-      <w:r>
-        <w:t>Customers: search by name, email, phone number, or membership number; create counter-only or email-enabled members.</w:t>
-      </w:r>
-    </w:p>
-    <w:p>
-      <w:pPr>
-        <w:pStyle w:val="ListBullet"/>
-      </w:pPr>
-      <w:r>
-        <w:t>Loyalty Programs: define qualifying products, required quantity, reward type, eligible reward products, dates, and repeatability.</w:t>
-      </w:r>
-    </w:p>
-    <w:p>
-      <w:pPr>
-        <w:pStyle w:val="ListBullet"/>
-      </w:pPr>
-      <w:r>
-        <w:t>Gift Cards: issue verified in-store cards, search existing cards, and manage physical gift fulfillment.</w:t>
-      </w:r>
-    </w:p>
-    <w:p>
-      <w:pPr>
-        <w:pStyle w:val="ListBullet"/>
-      </w:pPr>
-      <w:r>
-        <w:t>Scan Member: verify identity before reward redemption or member service.</w:t>
-      </w:r>
-    </w:p>
-    <w:p>
-      <w:pPr>
-        <w:pStyle w:val="Heading2"/>
-      </w:pPr>
-      <w:r>
-        <w:t>Catalog and Website Content</w:t>
-      </w:r>
-    </w:p>
-    <w:p>
-      <w:pPr>
-        <w:pStyle w:val="ListNumber"/>
-      </w:pPr>
-      <w:r>
-        <w:t>Create categories before assigning products to them.</w:t>
-      </w:r>
-    </w:p>
-    <w:p>
-      <w:pPr>
-        <w:pStyle w:val="ListNumber"/>
-      </w:pPr>
-      <w:r>
-        <w:t>Use Products to manage SKU, English product name, category, price, description, availability, badges, and customization settings.</w:t>
-      </w:r>
-    </w:p>
-    <w:p>
-      <w:pPr>
-        <w:pStyle w:val="ListNumber"/>
-      </w:pPr>
-      <w:r>
-        <w:t>Use Toppings for optional add-ons and assign them only to products that allow toppings.</w:t>
-      </w:r>
-    </w:p>
-    <w:p>
-      <w:pPr>
-        <w:pStyle w:val="ListNumber"/>
-      </w:pPr>
-      <w:r>
-        <w:t>Use Combos to select the included products and set the combo price. Use Previous / Next on the storefront to review active combos.</w:t>
-      </w:r>
-    </w:p>
-    <w:p>
-      <w:pPr>
-        <w:pStyle w:val="ListNumber"/>
-      </w:pPr>
-      <w:r>
-        <w:t>Use Promotions and Website Content to maintain public messages, dates, images, contact details, and store information.</w:t>
-      </w:r>
-    </w:p>
-    <w:p>
-      <w:pPr>
-        <w:pStyle w:val="ListNumber"/>
-      </w:pPr>
-      <w:r>
-        <w:t>Hide unavailable items instead of deleting records that may be referenced by orders or loyalty programs.</w:t>
-      </w:r>
-    </w:p>
-    <w:p>
-      <w:pPr>
-        <w:spacing w:before="100" w:after="160" w:line="269" w:lineRule="auto"/>
-        <w:ind w:left="173" w:right="173"/>
-        <w:shd w:fill="EDF5F1"/>
-      </w:pPr>
-      <w:r>
-        <w:rPr>
-          <w:rFonts w:ascii="Aptos" w:hAnsi="Aptos"/>
-          <w:b/>
-          <w:color w:val="0F513A"/>
-          <w:sz w:val="20"/>
-        </w:rPr>
-        <w:t xml:space="preserve">Images: </w:t>
-      </w:r>
-      <w:r>
-        <w:rPr>
-          <w:rFonts w:ascii="Aptos" w:hAnsi="Aptos"/>
-          <w:color w:val="1B2420"/>
-          <w:sz w:val="20"/>
-        </w:rPr>
-        <w:t>Upload product, promotion, logo, and profile images through the relevant Admin form. Confirm the preview before saving.</w:t>
-      </w:r>
-    </w:p>
-    <w:p>
-      <w:pPr>
-        <w:pStyle w:val="Heading2"/>
-      </w:pPr>
-      <w:r>
-        <w:t>Reports and Oversight</w:t>
-      </w:r>
-    </w:p>
-    <w:p>
-      <w:pPr>
-        <w:pStyle w:val="ListBullet"/>
-      </w:pPr>
-      <w:r>
-        <w:t>Dashboard: today’s orders, revenue, active products, live promotions, and recent activity.</w:t>
-      </w:r>
-    </w:p>
-    <w:p>
-      <w:pPr>
-        <w:pStyle w:val="ListBullet"/>
-      </w:pPr>
-      <w:r>
-        <w:t>Report Center and KPI Dashboard: sales and operational summaries for the selected date range.</w:t>
-      </w:r>
-    </w:p>
-    <w:p>
-      <w:pPr>
-        <w:pStyle w:val="ListBullet"/>
-      </w:pPr>
-      <w:r>
-        <w:t>Customer Analytics: new, returning, loyal, and VIP segments plus purchase behavior.</w:t>
-      </w:r>
-    </w:p>
-    <w:p>
-      <w:pPr>
-        <w:pStyle w:val="ListBullet"/>
-      </w:pPr>
-      <w:r>
-        <w:t>Product and Promotion Analytics: product performance, combo results, and campaign activity.</w:t>
-      </w:r>
-    </w:p>
-    <w:p>
-      <w:pPr>
-        <w:pStyle w:val="ListBullet"/>
-      </w:pPr>
-      <w:r>
-        <w:t>Staff Reports: schedule and labor summaries. Compensation details are management-only.</w:t>
-      </w:r>
-    </w:p>
-    <w:p>
-      <w:pPr>
-        <w:pStyle w:val="ListBullet"/>
-      </w:pPr>
-      <w:r>
-        <w:t>Activity Log and Contact Messages: review operational changes and respond to customer inquiries.</w:t>
+        <w:t>On All, the merchandising priority is New, then Best Seller, then Must Try.</w:t>
       </w:r>
     </w:p>
     <w:p>
@@ -1653,99 +1339,163 @@
     <w:p>
       <w:pPr>
         <w:pStyle w:val="Subtitle"/>
-        <w:spacing w:after="240"/>
       </w:pPr>
       <w:r>
-        <w:t>Use all Manager workflows and maintain final accountability for access, financial settings, and store policy.</w:t>
+        <w:t>Use every Manager workflow and maintain final control over access, financial settings, and store policy.</w:t>
       </w:r>
     </w:p>
     <w:p>
       <w:pPr>
-        <w:pStyle w:val="Heading2"/>
+        <w:spacing w:before="100" w:after="60"/>
+        <w:jc w:val="center"/>
       </w:pPr>
       <w:r>
-        <w:t>Owner Responsibilities</w:t>
+        <w:drawing>
+          <wp:inline xmlns:a="http://schemas.openxmlformats.org/drawingml/2006/main" xmlns:pic="http://schemas.openxmlformats.org/drawingml/2006/picture">
+            <wp:extent cx="5806440" cy="2719858"/>
+            <wp:docPr id="7" name="Picture 7" descr="Owner dashboard showing orders, revenue, products, promotions, recent orders, and store management shortcuts" title="Figure 7. Owner dashboard with live metrics, recent orders, and quick actions."/>
+            <wp:cNvGraphicFramePr>
+              <a:graphicFrameLocks noChangeAspect="1"/>
+            </wp:cNvGraphicFramePr>
+            <a:graphic>
+              <a:graphicData uri="http://schemas.openxmlformats.org/drawingml/2006/picture">
+                <pic:pic>
+                  <pic:nvPicPr>
+                    <pic:cNvPr id="0" name="codex-clipboard-6201daf5-9b90-4915-a0e8-7b9e4bfc2275.png"/>
+                    <pic:cNvPicPr/>
+                  </pic:nvPicPr>
+                  <pic:blipFill>
+                    <a:blip r:embed="rId17"/>
+                    <a:stretch>
+                      <a:fillRect/>
+                    </a:stretch>
+                  </pic:blipFill>
+                  <pic:spPr>
+                    <a:xfrm>
+                      <a:off x="0" y="0"/>
+                      <a:ext cx="5806440" cy="2719858"/>
+                    </a:xfrm>
+                    <a:prstGeom prst="rect"/>
+                  </pic:spPr>
+                </pic:pic>
+              </a:graphicData>
+            </a:graphic>
+          </wp:inline>
+        </w:drawing>
       </w:r>
     </w:p>
     <w:p>
       <w:pPr>
-        <w:pStyle w:val="ListBullet"/>
+        <w:spacing w:after="160"/>
+        <w:jc w:val="center"/>
       </w:pPr>
       <w:r>
-        <w:t>Approve who receives Manager or Owner access and deactivate accounts that should no longer enter Admin.</w:t>
-      </w:r>
-    </w:p>
-    <w:p>
-      <w:pPr>
-        <w:pStyle w:val="ListBullet"/>
-      </w:pPr>
-      <w:r>
-        <w:t>Review compensation, labor forecasts, loyalty liabilities, gift card activity, and operational reports.</w:t>
-      </w:r>
-    </w:p>
-    <w:p>
-      <w:pPr>
-        <w:pStyle w:val="ListBullet"/>
-      </w:pPr>
-      <w:r>
-        <w:t>Confirm production catalog and website content before major launches or seasonal changes.</w:t>
-      </w:r>
-    </w:p>
-    <w:p>
-      <w:pPr>
-        <w:pStyle w:val="ListBullet"/>
-      </w:pPr>
-      <w:r>
-        <w:t>Keep at least one secure Owner account available and do not share Owner credentials.</w:t>
-      </w:r>
-    </w:p>
-    <w:p>
-      <w:pPr>
-        <w:pStyle w:val="Heading2"/>
-      </w:pPr>
-      <w:r>
-        <w:t>Recommended Weekly Review</w:t>
+        <w:rPr>
+          <w:rFonts w:ascii="Aptos" w:hAnsi="Aptos"/>
+          <w:b w:val="0"/>
+          <w:i/>
+          <w:color w:val="66756E"/>
+          <w:sz w:val="18"/>
+        </w:rPr>
+        <w:t>Figure 7. Owner dashboard with live metrics, recent orders, and quick actions.</w:t>
       </w:r>
     </w:p>
     <w:p>
       <w:pPr>
         <w:pStyle w:val="ListNumber"/>
+        <w:spacing w:after="80"/>
       </w:pPr>
       <w:r>
-        <w:t>Review incomplete orders, contact messages, gift card exceptions, and physical gifts waiting for fulfillment.</w:t>
+        <w:t>Review daily orders, revenue, active products, live promotions, and recent order activity.</w:t>
       </w:r>
     </w:p>
     <w:p>
       <w:pPr>
         <w:pStyle w:val="ListNumber"/>
+        <w:spacing w:after="80"/>
       </w:pPr>
       <w:r>
-        <w:t>Confirm next week’s published schedule against approved time off and employee availability.</w:t>
+        <w:t>Manage Staff accounts and assign the lowest role needed for each job.</w:t>
       </w:r>
     </w:p>
     <w:p>
       <w:pPr>
         <w:pStyle w:val="ListNumber"/>
+        <w:spacing w:after="80"/>
       </w:pPr>
       <w:r>
-        <w:t>Review sales, customer, product, promotion, and labor reports.</w:t>
+        <w:t>Review compensation, labor, loyalty liability, gift-card activity, and audit logs.</w:t>
       </w:r>
     </w:p>
     <w:p>
       <w:pPr>
         <w:pStyle w:val="ListNumber"/>
+        <w:spacing w:after="80"/>
       </w:pPr>
       <w:r>
-        <w:t>Check active loyalty programs and their dates, eligible products, and reward terms.</w:t>
+        <w:t>Confirm catalog, combo, topping, and website-content changes before major releases.</w:t>
       </w:r>
     </w:p>
     <w:p>
       <w:pPr>
         <w:pStyle w:val="ListNumber"/>
+        <w:spacing w:after="80"/>
       </w:pPr>
       <w:r>
-        <w:t>Review staff access and the Activity Log for unexpected changes.</w:t>
+        <w:t>Keep at least one secure Owner account and never share Owner credentials.</w:t>
       </w:r>
+    </w:p>
+    <w:tbl>
+      <w:tblPr>
+        <w:tblW w:type="auto" w:w="0"/>
+        <w:tblLayout w:type="fixed"/>
+        <w:tblLook w:firstColumn="1" w:firstRow="1" w:lastColumn="0" w:lastRow="0" w:noHBand="0" w:noVBand="1" w:val="04A0"/>
+      </w:tblPr>
+      <w:tblGrid>
+        <w:gridCol w:w="9360"/>
+      </w:tblGrid>
+      <w:tr>
+        <w:tc>
+          <w:tcPr>
+            <w:tcW w:type="dxa" w:w="9360"/>
+            <w:shd w:fill="EDF5F1"/>
+            <w:tcMar>
+              <w:top w:w="130" w:type="dxa"/>
+              <w:start w:w="160" w:type="dxa"/>
+              <w:bottom w:w="130" w:type="dxa"/>
+              <w:end w:w="160" w:type="dxa"/>
+            </w:tcMar>
+          </w:tcPr>
+          <w:p>
+            <w:pPr>
+              <w:spacing w:after="0"/>
+            </w:pPr>
+            <w:r>
+              <w:rPr>
+                <w:rFonts w:ascii="Aptos" w:hAnsi="Aptos"/>
+                <w:b/>
+                <w:color w:val="0F513A"/>
+                <w:sz w:val="21"/>
+              </w:rPr>
+              <w:t xml:space="preserve">Profile photos: </w:t>
+            </w:r>
+            <w:r>
+              <w:rPr>
+                <w:rFonts w:ascii="Aptos" w:hAnsi="Aptos"/>
+                <w:b w:val="0"/>
+                <w:color w:val="1B2420"/>
+                <w:sz w:val="21"/>
+              </w:rPr>
+              <w:t>Each authenticated staff member can upload their own profile photo from My Account. The image appears in the top-right avatar and employee views.</w:t>
+            </w:r>
+          </w:p>
+        </w:tc>
+      </w:tr>
+    </w:tbl>
+    <w:p>
+      <w:pPr>
+        <w:spacing w:after="20"/>
+      </w:pPr>
     </w:p>
     <w:p>
       <w:r>
@@ -1776,201 +1526,199 @@
     </w:p>
     <w:p>
       <w:pPr>
-        <w:pStyle w:val="Heading2"/>
+        <w:spacing w:after="40"/>
       </w:pPr>
       <w:r>
-        <w:t>Common Issues</w:t>
+        <w:rPr>
+          <w:rFonts w:ascii="Aptos" w:hAnsi="Aptos"/>
+          <w:b/>
+          <w:color w:val="0F513A"/>
+          <w:sz w:val="22"/>
+        </w:rPr>
+        <w:t>Cannot enter Admin</w:t>
       </w:r>
     </w:p>
     <w:p>
       <w:pPr>
-        <w:pStyle w:val="Heading3"/>
+        <w:spacing w:after="160"/>
+        <w:ind w:left="259"/>
       </w:pPr>
       <w:r>
-        <w:t>I cannot enter Admin</w:t>
-      </w:r>
-    </w:p>
-    <w:p>
-      <w:r>
-        <w:t>Confirm you are using a Staff account. A signed-in customer account is not a Staff identity. Sign out of the customer account, then sign in at /admin with staff credentials.</w:t>
+        <w:t>Sign out of the customer account and use assigned Staff credentials at /admin.</w:t>
       </w:r>
     </w:p>
     <w:p>
       <w:pPr>
-        <w:pStyle w:val="Heading3"/>
+        <w:spacing w:after="40"/>
       </w:pPr>
       <w:r>
-        <w:t>I only see My Account</w:t>
-      </w:r>
-    </w:p>
-    <w:p>
-      <w:r>
-        <w:t>Change the temporary staff password. Full role access is enabled after the required password change.</w:t>
+        <w:rPr>
+          <w:rFonts w:ascii="Aptos" w:hAnsi="Aptos"/>
+          <w:b/>
+          <w:color w:val="0F513A"/>
+          <w:sz w:val="22"/>
+        </w:rPr>
+        <w:t>Product has no toppings</w:t>
       </w:r>
     </w:p>
     <w:p>
       <w:pPr>
-        <w:pStyle w:val="Heading3"/>
+        <w:spacing w:after="160"/>
+        <w:ind w:left="259"/>
       </w:pPr>
       <w:r>
-        <w:t>A product or combo is missing</w:t>
-      </w:r>
-    </w:p>
-    <w:p>
-      <w:r>
-        <w:t>Ask a Manager to confirm the item, category, and all included products are Active and not Sold Out.</w:t>
+        <w:t>Ask a Manager to confirm Allow toppings is enabled and the correct topping links are selected.</w:t>
       </w:r>
     </w:p>
     <w:p>
       <w:pPr>
-        <w:pStyle w:val="Heading3"/>
+        <w:spacing w:after="40"/>
       </w:pPr>
       <w:r>
-        <w:t>Search shows no products</w:t>
-      </w:r>
-    </w:p>
-    <w:p>
-      <w:r>
-        <w:t>Clear the search text, select All, and check spelling. On mobile, use the Menu-page search field.</w:t>
+        <w:rPr>
+          <w:rFonts w:ascii="Aptos" w:hAnsi="Aptos"/>
+          <w:b/>
+          <w:color w:val="0F513A"/>
+          <w:sz w:val="22"/>
+        </w:rPr>
+        <w:t>Availability is missing from schedule</w:t>
       </w:r>
     </w:p>
     <w:p>
       <w:pPr>
-        <w:pStyle w:val="Heading3"/>
+        <w:spacing w:after="160"/>
+        <w:ind w:left="259"/>
       </w:pPr>
       <w:r>
-        <w:t>I cannot reopen a completed order</w:t>
-      </w:r>
-    </w:p>
-    <w:p>
-      <w:r>
-        <w:t>This is expected. Completed is a final locked status. Contact a Manager for a separate corrective workflow if needed.</w:t>
+        <w:t>A registration is only availability; a Manager must publish a work shift.</w:t>
       </w:r>
     </w:p>
     <w:p>
       <w:pPr>
-        <w:pStyle w:val="Heading3"/>
+        <w:spacing w:after="40"/>
       </w:pPr>
       <w:r>
-        <w:t>My shift registration is not on the schedule</w:t>
-      </w:r>
-    </w:p>
-    <w:p>
-      <w:r>
-        <w:t>Availability registration is not a published shift. Wait for a Manager to assign and publish the final shift.</w:t>
+        <w:rPr>
+          <w:rFonts w:ascii="Aptos" w:hAnsi="Aptos"/>
+          <w:b/>
+          <w:color w:val="0F513A"/>
+          <w:sz w:val="22"/>
+        </w:rPr>
+        <w:t>Cannot change Completed</w:t>
       </w:r>
     </w:p>
     <w:p>
       <w:pPr>
-        <w:pStyle w:val="Heading3"/>
+        <w:spacing w:after="160"/>
+        <w:ind w:left="259"/>
       </w:pPr>
       <w:r>
-        <w:t>A reward cannot be selected</w:t>
-      </w:r>
-    </w:p>
-    <w:p>
-      <w:r>
-        <w:t>Confirm the reward is active, unexpired, and that an eligible product is already in the order.</w:t>
+        <w:t>This is expected. Completed is locked and cannot return to an earlier status.</w:t>
       </w:r>
     </w:p>
     <w:p>
       <w:pPr>
-        <w:pStyle w:val="Heading3"/>
+        <w:spacing w:after="40"/>
       </w:pPr>
       <w:r>
-        <w:t>The catalog briefly shows old items</w:t>
-      </w:r>
-    </w:p>
-    <w:p>
-      <w:r>
-        <w:t>Wait a few seconds for the live catalog to load, then refresh once. If it persists, notify a Manager.</w:t>
+        <w:rPr>
+          <w:rFonts w:ascii="Aptos" w:hAnsi="Aptos"/>
+          <w:b/>
+          <w:color w:val="0F513A"/>
+          <w:sz w:val="22"/>
+        </w:rPr>
+        <w:t>Search returns no items</w:t>
       </w:r>
     </w:p>
     <w:p>
       <w:pPr>
-        <w:pStyle w:val="Heading2"/>
+        <w:spacing w:after="160"/>
+        <w:ind w:left="259"/>
       </w:pPr>
       <w:r>
-        <w:t>Security and Data Handling</w:t>
+        <w:t>Clear search text, choose All, and check spelling. On mobile, use the Menu-page search field.</w:t>
       </w:r>
     </w:p>
     <w:p>
       <w:pPr>
-        <w:pStyle w:val="ListBullet"/>
+        <w:spacing w:after="40"/>
       </w:pPr>
       <w:r>
-        <w:t>Never share customer or staff passwords.</w:t>
+        <w:rPr>
+          <w:rFonts w:ascii="Aptos" w:hAnsi="Aptos"/>
+          <w:b/>
+          <w:color w:val="0F513A"/>
+          <w:sz w:val="22"/>
+        </w:rPr>
+        <w:t>Combo is missing</w:t>
       </w:r>
     </w:p>
     <w:p>
       <w:pPr>
-        <w:pStyle w:val="ListBullet"/>
+        <w:spacing w:after="160"/>
+        <w:ind w:left="259"/>
       </w:pPr>
       <w:r>
-        <w:t>Do not photograph or copy member details unless required for authorized store service.</w:t>
+        <w:t>Confirm the combo is Active and all included products are active and available.</w:t>
       </w:r>
     </w:p>
+    <w:tbl>
+      <w:tblPr>
+        <w:tblW w:type="auto" w:w="0"/>
+        <w:tblLayout w:type="fixed"/>
+        <w:tblLook w:firstColumn="1" w:firstRow="1" w:lastColumn="0" w:lastRow="0" w:noHBand="0" w:noVBand="1" w:val="04A0"/>
+      </w:tblPr>
+      <w:tblGrid>
+        <w:gridCol w:w="9360"/>
+      </w:tblGrid>
+      <w:tr>
+        <w:tc>
+          <w:tcPr>
+            <w:tcW w:type="dxa" w:w="9360"/>
+            <w:shd w:fill="EDF5F1"/>
+            <w:tcMar>
+              <w:top w:w="130" w:type="dxa"/>
+              <w:start w:w="160" w:type="dxa"/>
+              <w:bottom w:w="130" w:type="dxa"/>
+              <w:end w:w="160" w:type="dxa"/>
+            </w:tcMar>
+          </w:tcPr>
+          <w:p>
+            <w:pPr>
+              <w:spacing w:after="0"/>
+            </w:pPr>
+            <w:r>
+              <w:rPr>
+                <w:rFonts w:ascii="Aptos" w:hAnsi="Aptos"/>
+                <w:b/>
+                <w:color w:val="0F513A"/>
+                <w:sz w:val="21"/>
+              </w:rPr>
+              <w:t xml:space="preserve">Security: </w:t>
+            </w:r>
+            <w:r>
+              <w:rPr>
+                <w:rFonts w:ascii="Aptos" w:hAnsi="Aptos"/>
+                <w:b w:val="0"/>
+                <w:color w:val="1B2420"/>
+                <w:sz w:val="21"/>
+              </w:rPr>
+              <w:t>Never share passwords, expose customer data, or leave a shared counter signed in. Verify the customer before revealing gift-card or reward information.</w:t>
+            </w:r>
+          </w:p>
+        </w:tc>
+      </w:tr>
+    </w:tbl>
     <w:p>
       <w:pPr>
-        <w:pStyle w:val="ListBullet"/>
+        <w:spacing w:after="20"/>
       </w:pPr>
-      <w:r>
-        <w:t>Verify the customer before revealing gift card information or redeeming rewards.</w:t>
-      </w:r>
-    </w:p>
-    <w:p>
-      <w:pPr>
-        <w:pStyle w:val="ListBullet"/>
-      </w:pPr>
-      <w:r>
-        <w:t>Sign out when leaving a shared counter or back-office device.</w:t>
-      </w:r>
-    </w:p>
-    <w:p>
-      <w:pPr>
-        <w:pStyle w:val="ListBullet"/>
-      </w:pPr>
-      <w:r>
-        <w:t>Use the lowest role that gives an employee the access needed for their work.</w:t>
-      </w:r>
-    </w:p>
-    <w:p>
-      <w:pPr>
-        <w:pStyle w:val="Heading2"/>
-      </w:pPr>
-      <w:r>
-        <w:t>Quick Role Escalation</w:t>
-      </w:r>
-    </w:p>
-    <w:p>
-      <w:pPr>
-        <w:pStyle w:val="ListBullet"/>
-      </w:pPr>
-      <w:r>
-        <w:t>Customer question or order progress: Staff or Supervisor.</w:t>
-      </w:r>
-    </w:p>
-    <w:p>
-      <w:pPr>
-        <w:pStyle w:val="ListBullet"/>
-      </w:pPr>
-      <w:r>
-        <w:t>Schedule, time-off approval, employee, catalog, loyalty, or gift-card configuration: Manager.</w:t>
-      </w:r>
-    </w:p>
-    <w:p>
-      <w:pPr>
-        <w:pStyle w:val="ListBullet"/>
-      </w:pPr>
-      <w:r>
-        <w:t>Role access, compensation, policy, or high-impact production change: Owner.</w:t>
-      </w:r>
     </w:p>
     <w:sectPr>
       <w:headerReference w:type="default" r:id="rId9"/>
       <w:footerReference w:type="default" r:id="rId10"/>
       <w:pgSz w:w="12240" w:h="15840"/>
-      <w:pgMar w:top="1123" w:right="1181" w:bottom="1037" w:left="1181" w:header="547" w:footer="547" w:gutter="0"/>
+      <w:pgMar w:top="1123" w:right="1440" w:bottom="1123" w:left="1440" w:header="547" w:footer="547" w:gutter="0"/>
       <w:cols w:space="720"/>
       <w:docGrid w:linePitch="360"/>
     </w:sectPr>
@@ -1983,18 +1731,16 @@
   <w:p>
     <w:pPr>
       <w:pStyle w:val="Footer"/>
-      <w:jc w:val="right"/>
+      <w:jc w:val="center"/>
     </w:pPr>
     <w:r>
       <w:rPr>
         <w:rFonts w:ascii="Aptos" w:hAnsi="Aptos"/>
+        <w:b w:val="0"/>
         <w:color w:val="66756E"/>
         <w:sz w:val="17"/>
       </w:rPr>
-      <w:t xml:space="preserve">Page </w:t>
-      <w:fldChar w:fldCharType="begin"/>
-      <w:instrText xml:space="preserve">PAGE</w:instrText>
-      <w:fldChar w:fldCharType="end"/>
+      <w:t>LEVIEN CAFE • Everyday workflows by role</w:t>
     </w:r>
   </w:p>
 </w:ftr>
@@ -2005,15 +1751,16 @@
   <w:p>
     <w:pPr>
       <w:pStyle w:val="Header"/>
+      <w:jc w:val="right"/>
     </w:pPr>
     <w:r>
       <w:rPr>
         <w:rFonts w:ascii="Aptos" w:hAnsi="Aptos"/>
         <w:b/>
-        <w:color w:val="0F513A"/>
+        <w:color w:val="66756E"/>
         <w:sz w:val="17"/>
       </w:rPr>
-      <w:t>LEVIEN CAFE  |  USER GUIDE</w:t>
+      <w:t>LEVIEN CAFE  |  VISUAL USER GUIDE</w:t>
     </w:r>
   </w:p>
 </w:hdr>
@@ -2383,7 +2130,7 @@
     <w:qFormat/>
     <w:rsid w:val="00FC693F"/>
     <w:pPr>
-      <w:spacing w:after="120" w:line="283" w:lineRule="auto"/>
+      <w:spacing w:after="120" w:line="278" w:lineRule="auto"/>
     </w:pPr>
     <w:rPr>
       <w:rFonts w:ascii="Aptos" w:hAnsi="Aptos"/>
@@ -2446,7 +2193,7 @@
     <w:pPr>
       <w:keepNext/>
       <w:keepLines/>
-      <w:spacing w:before="320" w:after="160"/>
+      <w:spacing w:before="280" w:after="160"/>
       <w:outlineLvl w:val="0"/>
     </w:pPr>
     <w:rPr>
@@ -2454,7 +2201,7 @@
       <w:b/>
       <w:bCs/>
       <w:color w:val="0F513A"/>
-      <w:sz w:val="40"/>
+      <w:sz w:val="44"/>
       <w:szCs w:val="28"/>
     </w:rPr>
   </w:style>
@@ -2470,7 +2217,7 @@
     <w:pPr>
       <w:keepNext/>
       <w:keepLines/>
-      <w:spacing w:before="240" w:after="100"/>
+      <w:spacing w:before="240" w:after="120"/>
       <w:outlineLvl w:val="1"/>
     </w:pPr>
     <w:rPr>
@@ -2478,7 +2225,7 @@
       <w:b/>
       <w:bCs/>
       <w:color w:val="0F513A"/>
-      <w:sz w:val="28"/>
+      <w:sz w:val="30"/>
       <w:szCs w:val="26"/>
     </w:rPr>
   </w:style>
@@ -2494,15 +2241,15 @@
     <w:pPr>
       <w:keepNext/>
       <w:keepLines/>
-      <w:spacing w:before="180" w:after="80"/>
+      <w:spacing w:before="160" w:after="80"/>
       <w:outlineLvl w:val="2"/>
     </w:pPr>
     <w:rPr>
       <w:rFonts w:asciiTheme="majorHAnsi" w:eastAsiaTheme="majorEastAsia" w:hAnsiTheme="majorHAnsi" w:cstheme="majorBidi" w:ascii="Aptos Display" w:hAnsi="Aptos Display"/>
       <w:b/>
       <w:bCs/>
-      <w:color w:val="17352A"/>
-      <w:sz w:val="23"/>
+      <w:color w:val="0F513A"/>
+      <w:sz w:val="24"/>
     </w:rPr>
   </w:style>
   <w:style w:type="paragraph" w:styleId="Heading4">
@@ -2733,20 +2480,18 @@
     <w:qFormat/>
     <w:rsid w:val="00FC693F"/>
     <w:pPr>
-      <w:keepNext/>
       <w:pBdr>
         <w:bottom w:val="single" w:sz="8" w:space="4" w:color="4F81BD" w:themeColor="accent1"/>
       </w:pBdr>
-      <w:spacing w:after="160" w:line="240" w:lineRule="auto" w:before="0"/>
+      <w:spacing w:after="300" w:line="240" w:lineRule="auto"/>
       <w:contextualSpacing/>
     </w:pPr>
     <w:rPr>
-      <w:rFonts w:asciiTheme="majorHAnsi" w:eastAsiaTheme="majorEastAsia" w:hAnsiTheme="majorHAnsi" w:cstheme="majorBidi" w:ascii="Aptos Display" w:hAnsi="Aptos Display"/>
-      <w:b/>
-      <w:color w:val="0F513A"/>
+      <w:rFonts w:asciiTheme="majorHAnsi" w:eastAsiaTheme="majorEastAsia" w:hAnsiTheme="majorHAnsi" w:cstheme="majorBidi"/>
+      <w:color w:val="17365D" w:themeColor="text2" w:themeShade="BF"/>
       <w:spacing w:val="5"/>
       <w:kern w:val="28"/>
-      <w:sz w:val="60"/>
+      <w:sz w:val="52"/>
       <w:szCs w:val="52"/>
     </w:rPr>
   </w:style>
@@ -2774,20 +2519,17 @@
     <w:qFormat/>
     <w:rsid w:val="00FC693F"/>
     <w:pPr>
-      <w:keepNext/>
       <w:numPr>
         <w:ilvl w:val="1"/>
       </w:numPr>
-      <w:spacing w:before="0" w:after="240"/>
     </w:pPr>
     <w:rPr>
       <w:rFonts w:asciiTheme="majorHAnsi" w:eastAsiaTheme="majorEastAsia" w:hAnsiTheme="majorHAnsi" w:cstheme="majorBidi" w:ascii="Aptos" w:hAnsi="Aptos"/>
-      <w:b w:val="0"/>
       <w:i/>
       <w:iCs/>
       <w:color w:val="66756E"/>
       <w:spacing w:val="15"/>
-      <w:sz w:val="26"/>
+      <w:sz w:val="23"/>
       <w:szCs w:val="24"/>
     </w:rPr>
   </w:style>
@@ -2923,14 +2665,8 @@
       <w:numPr>
         <w:numId w:val="1"/>
       </w:numPr>
-      <w:spacing w:after="80" w:line="283" w:lineRule="auto"/>
-      <w:ind w:left="547" w:hanging="274"/>
       <w:contextualSpacing/>
     </w:pPr>
-    <w:rPr>
-      <w:rFonts w:ascii="Aptos" w:hAnsi="Aptos"/>
-      <w:sz w:val="21"/>
-    </w:rPr>
   </w:style>
   <w:style w:type="paragraph" w:styleId="ListBullet2">
     <w:name w:val="List Bullet 2"/>
@@ -2968,14 +2704,8 @@
       <w:numPr>
         <w:numId w:val="5"/>
       </w:numPr>
-      <w:spacing w:after="80" w:line="283" w:lineRule="auto"/>
-      <w:ind w:left="547" w:hanging="274"/>
       <w:contextualSpacing/>
     </w:pPr>
-    <w:rPr>
-      <w:rFonts w:ascii="Aptos" w:hAnsi="Aptos"/>
-      <w:sz w:val="21"/>
-    </w:rPr>
   </w:style>
   <w:style w:type="paragraph" w:styleId="ListNumber2">
     <w:name w:val="List Number 2"/>

</xml_diff>

<commit_message>
docs: add screenshots to role-based user guide
</commit_message>
<xml_diff>
--- a/outputs/user-guide/LEVIEN_CAFE_User_Guide.docx
+++ b/outputs/user-guide/LEVIEN_CAFE_User_Guide.docx
@@ -61,57 +61,30 @@
         <w:t>Step-by-step instructions for Customers, Staff, Supervisors, Managers, and Owners</w:t>
       </w:r>
     </w:p>
-    <w:tbl>
-      <w:tblPr>
-        <w:tblW w:type="auto" w:w="0"/>
-        <w:tblLayout w:type="fixed"/>
-        <w:tblLook w:firstColumn="1" w:firstRow="1" w:lastColumn="0" w:lastRow="0" w:noHBand="0" w:noVBand="1" w:val="04A0"/>
-      </w:tblPr>
-      <w:tblGrid>
-        <w:gridCol w:w="9360"/>
-      </w:tblGrid>
-      <w:tr>
-        <w:tc>
-          <w:tcPr>
-            <w:tcW w:type="dxa" w:w="9360"/>
-            <w:shd w:fill="EDF5F1"/>
-            <w:tcMar>
-              <w:top w:w="130" w:type="dxa"/>
-              <w:start w:w="160" w:type="dxa"/>
-              <w:bottom w:w="130" w:type="dxa"/>
-              <w:end w:w="160" w:type="dxa"/>
-            </w:tcMar>
-          </w:tcPr>
-          <w:p>
-            <w:pPr>
-              <w:spacing w:after="0"/>
-            </w:pPr>
-            <w:r>
-              <w:rPr>
-                <w:rFonts w:ascii="Aptos" w:hAnsi="Aptos"/>
-                <w:b/>
-                <w:color w:val="0F513A"/>
-                <w:sz w:val="21"/>
-              </w:rPr>
-              <w:t xml:space="preserve">How to use this guide: </w:t>
-            </w:r>
-            <w:r>
-              <w:rPr>
-                <w:rFonts w:ascii="Aptos" w:hAnsi="Aptos"/>
-                <w:b w:val="0"/>
-                <w:color w:val="1B2420"/>
-                <w:sz w:val="21"/>
-              </w:rPr>
-              <w:t>Go directly to your role. Screenshots show the page or control used for each workflow. Interface labels are written exactly as they appear in the application.</w:t>
-            </w:r>
-          </w:p>
-        </w:tc>
-      </w:tr>
-    </w:tbl>
     <w:p>
       <w:pPr>
-        <w:spacing w:after="20"/>
+        <w:spacing w:before="100" w:after="160"/>
+        <w:ind w:left="173" w:right="173"/>
+        <w:shd w:fill="EDF5F1"/>
       </w:pPr>
+      <w:r>
+        <w:rPr>
+          <w:rFonts w:ascii="Aptos" w:hAnsi="Aptos"/>
+          <w:b/>
+          <w:color w:val="0F513A"/>
+          <w:sz w:val="21"/>
+        </w:rPr>
+        <w:t xml:space="preserve">How to use this guide: </w:t>
+      </w:r>
+      <w:r>
+        <w:rPr>
+          <w:rFonts w:ascii="Aptos" w:hAnsi="Aptos"/>
+          <w:b w:val="0"/>
+          <w:color w:val="1B2420"/>
+          <w:sz w:val="21"/>
+        </w:rPr>
+        <w:t>Go directly to your role. Screenshots show the page or control used for each workflow. Interface labels are written exactly as they appear in the application.</w:t>
+      </w:r>
     </w:p>
     <w:p>
       <w:pPr>
@@ -166,6 +139,9 @@
         <w:gridCol w:w="7272"/>
       </w:tblGrid>
       <w:tr>
+        <w:trPr>
+          <w:tblHeader w:val="true"/>
+        </w:trPr>
         <w:tc>
           <w:tcPr>
             <w:tcW w:type="dxa" w:w="4680"/>
@@ -429,57 +405,30 @@
         </w:tc>
       </w:tr>
     </w:tbl>
-    <w:tbl>
-      <w:tblPr>
-        <w:tblW w:type="auto" w:w="0"/>
-        <w:tblLayout w:type="fixed"/>
-        <w:tblLook w:firstColumn="1" w:firstRow="1" w:lastColumn="0" w:lastRow="0" w:noHBand="0" w:noVBand="1" w:val="04A0"/>
-      </w:tblPr>
-      <w:tblGrid>
-        <w:gridCol w:w="9360"/>
-      </w:tblGrid>
-      <w:tr>
-        <w:tc>
-          <w:tcPr>
-            <w:tcW w:type="dxa" w:w="9360"/>
-            <w:shd w:fill="EDF5F1"/>
-            <w:tcMar>
-              <w:top w:w="130" w:type="dxa"/>
-              <w:start w:w="160" w:type="dxa"/>
-              <w:bottom w:w="130" w:type="dxa"/>
-              <w:end w:w="160" w:type="dxa"/>
-            </w:tcMar>
-          </w:tcPr>
-          <w:p>
-            <w:pPr>
-              <w:spacing w:after="0"/>
-            </w:pPr>
-            <w:r>
-              <w:rPr>
-                <w:rFonts w:ascii="Aptos" w:hAnsi="Aptos"/>
-                <w:b/>
-                <w:color w:val="0F513A"/>
-                <w:sz w:val="21"/>
-              </w:rPr>
-              <w:t xml:space="preserve">Access rule: </w:t>
-            </w:r>
-            <w:r>
-              <w:rPr>
-                <w:rFonts w:ascii="Aptos" w:hAnsi="Aptos"/>
-                <w:b w:val="0"/>
-                <w:color w:val="1B2420"/>
-                <w:sz w:val="21"/>
-              </w:rPr>
-              <w:t>A customer account is not a Staff account. Staff members must sign in at /admin with their assigned staff credentials.</w:t>
-            </w:r>
-          </w:p>
-        </w:tc>
-      </w:tr>
-    </w:tbl>
     <w:p>
       <w:pPr>
-        <w:spacing w:after="20"/>
+        <w:spacing w:before="100" w:after="160"/>
+        <w:ind w:left="173" w:right="173"/>
+        <w:shd w:fill="EDF5F1"/>
       </w:pPr>
+      <w:r>
+        <w:rPr>
+          <w:rFonts w:ascii="Aptos" w:hAnsi="Aptos"/>
+          <w:b/>
+          <w:color w:val="0F513A"/>
+          <w:sz w:val="21"/>
+        </w:rPr>
+        <w:t xml:space="preserve">Access rule: </w:t>
+      </w:r>
+      <w:r>
+        <w:rPr>
+          <w:rFonts w:ascii="Aptos" w:hAnsi="Aptos"/>
+          <w:b w:val="0"/>
+          <w:color w:val="1B2420"/>
+          <w:sz w:val="21"/>
+        </w:rPr>
+        <w:t>A customer account is not a Staff account. Staff members must sign in at /admin with their assigned staff credentials.</w:t>
+      </w:r>
     </w:p>
     <w:p>
       <w:r>
@@ -616,57 +565,30 @@
         <w:t>Open My Order, review every line, and continue to checkout.</w:t>
       </w:r>
     </w:p>
-    <w:tbl>
-      <w:tblPr>
-        <w:tblW w:type="auto" w:w="0"/>
-        <w:tblLayout w:type="fixed"/>
-        <w:tblLook w:firstColumn="1" w:firstRow="1" w:lastColumn="0" w:lastRow="0" w:noHBand="0" w:noVBand="1" w:val="04A0"/>
-      </w:tblPr>
-      <w:tblGrid>
-        <w:gridCol w:w="9360"/>
-      </w:tblGrid>
-      <w:tr>
-        <w:tc>
-          <w:tcPr>
-            <w:tcW w:type="dxa" w:w="9360"/>
-            <w:shd w:fill="EDF5F1"/>
-            <w:tcMar>
-              <w:top w:w="130" w:type="dxa"/>
-              <w:start w:w="160" w:type="dxa"/>
-              <w:bottom w:w="130" w:type="dxa"/>
-              <w:end w:w="160" w:type="dxa"/>
-            </w:tcMar>
-          </w:tcPr>
-          <w:p>
-            <w:pPr>
-              <w:spacing w:after="0"/>
-            </w:pPr>
-            <w:r>
-              <w:rPr>
-                <w:rFonts w:ascii="Aptos" w:hAnsi="Aptos"/>
-                <w:b/>
-                <w:color w:val="0F513A"/>
-                <w:sz w:val="21"/>
-              </w:rPr>
-              <w:t xml:space="preserve">Combo visibility: </w:t>
-            </w:r>
-            <w:r>
-              <w:rPr>
-                <w:rFonts w:ascii="Aptos" w:hAnsi="Aptos"/>
-                <w:b w:val="0"/>
-                <w:color w:val="1B2420"/>
-                <w:sz w:val="21"/>
-              </w:rPr>
-              <w:t>The Combos link and combo section appear only when at least one combo is active. Use Previous and Next to review active combos.</w:t>
-            </w:r>
-          </w:p>
-        </w:tc>
-      </w:tr>
-    </w:tbl>
     <w:p>
       <w:pPr>
-        <w:spacing w:after="20"/>
+        <w:spacing w:before="100" w:after="160"/>
+        <w:ind w:left="173" w:right="173"/>
+        <w:shd w:fill="EDF5F1"/>
       </w:pPr>
+      <w:r>
+        <w:rPr>
+          <w:rFonts w:ascii="Aptos" w:hAnsi="Aptos"/>
+          <w:b/>
+          <w:color w:val="0F513A"/>
+          <w:sz w:val="21"/>
+        </w:rPr>
+        <w:t xml:space="preserve">Combo visibility: </w:t>
+      </w:r>
+      <w:r>
+        <w:rPr>
+          <w:rFonts w:ascii="Aptos" w:hAnsi="Aptos"/>
+          <w:b w:val="0"/>
+          <w:color w:val="1B2420"/>
+          <w:sz w:val="21"/>
+        </w:rPr>
+        <w:t>The Combos link and combo section appear only when at least one combo is active. Use Previous and Next to review active combos.</w:t>
+      </w:r>
     </w:p>
     <w:p>
       <w:pPr>
@@ -1445,57 +1367,30 @@
         <w:t>Keep at least one secure Owner account and never share Owner credentials.</w:t>
       </w:r>
     </w:p>
-    <w:tbl>
-      <w:tblPr>
-        <w:tblW w:type="auto" w:w="0"/>
-        <w:tblLayout w:type="fixed"/>
-        <w:tblLook w:firstColumn="1" w:firstRow="1" w:lastColumn="0" w:lastRow="0" w:noHBand="0" w:noVBand="1" w:val="04A0"/>
-      </w:tblPr>
-      <w:tblGrid>
-        <w:gridCol w:w="9360"/>
-      </w:tblGrid>
-      <w:tr>
-        <w:tc>
-          <w:tcPr>
-            <w:tcW w:type="dxa" w:w="9360"/>
-            <w:shd w:fill="EDF5F1"/>
-            <w:tcMar>
-              <w:top w:w="130" w:type="dxa"/>
-              <w:start w:w="160" w:type="dxa"/>
-              <w:bottom w:w="130" w:type="dxa"/>
-              <w:end w:w="160" w:type="dxa"/>
-            </w:tcMar>
-          </w:tcPr>
-          <w:p>
-            <w:pPr>
-              <w:spacing w:after="0"/>
-            </w:pPr>
-            <w:r>
-              <w:rPr>
-                <w:rFonts w:ascii="Aptos" w:hAnsi="Aptos"/>
-                <w:b/>
-                <w:color w:val="0F513A"/>
-                <w:sz w:val="21"/>
-              </w:rPr>
-              <w:t xml:space="preserve">Profile photos: </w:t>
-            </w:r>
-            <w:r>
-              <w:rPr>
-                <w:rFonts w:ascii="Aptos" w:hAnsi="Aptos"/>
-                <w:b w:val="0"/>
-                <w:color w:val="1B2420"/>
-                <w:sz w:val="21"/>
-              </w:rPr>
-              <w:t>Each authenticated staff member can upload their own profile photo from My Account. The image appears in the top-right avatar and employee views.</w:t>
-            </w:r>
-          </w:p>
-        </w:tc>
-      </w:tr>
-    </w:tbl>
     <w:p>
       <w:pPr>
-        <w:spacing w:after="20"/>
+        <w:spacing w:before="100" w:after="160"/>
+        <w:ind w:left="173" w:right="173"/>
+        <w:shd w:fill="EDF5F1"/>
       </w:pPr>
+      <w:r>
+        <w:rPr>
+          <w:rFonts w:ascii="Aptos" w:hAnsi="Aptos"/>
+          <w:b/>
+          <w:color w:val="0F513A"/>
+          <w:sz w:val="21"/>
+        </w:rPr>
+        <w:t xml:space="preserve">Profile photos: </w:t>
+      </w:r>
+      <w:r>
+        <w:rPr>
+          <w:rFonts w:ascii="Aptos" w:hAnsi="Aptos"/>
+          <w:b w:val="0"/>
+          <w:color w:val="1B2420"/>
+          <w:sz w:val="21"/>
+        </w:rPr>
+        <w:t>Each authenticated staff member can upload their own profile photo from My Account. The image appears in the top-right avatar and employee views.</w:t>
+      </w:r>
     </w:p>
     <w:p>
       <w:r>
@@ -1662,57 +1557,30 @@
         <w:t>Confirm the combo is Active and all included products are active and available.</w:t>
       </w:r>
     </w:p>
-    <w:tbl>
-      <w:tblPr>
-        <w:tblW w:type="auto" w:w="0"/>
-        <w:tblLayout w:type="fixed"/>
-        <w:tblLook w:firstColumn="1" w:firstRow="1" w:lastColumn="0" w:lastRow="0" w:noHBand="0" w:noVBand="1" w:val="04A0"/>
-      </w:tblPr>
-      <w:tblGrid>
-        <w:gridCol w:w="9360"/>
-      </w:tblGrid>
-      <w:tr>
-        <w:tc>
-          <w:tcPr>
-            <w:tcW w:type="dxa" w:w="9360"/>
-            <w:shd w:fill="EDF5F1"/>
-            <w:tcMar>
-              <w:top w:w="130" w:type="dxa"/>
-              <w:start w:w="160" w:type="dxa"/>
-              <w:bottom w:w="130" w:type="dxa"/>
-              <w:end w:w="160" w:type="dxa"/>
-            </w:tcMar>
-          </w:tcPr>
-          <w:p>
-            <w:pPr>
-              <w:spacing w:after="0"/>
-            </w:pPr>
-            <w:r>
-              <w:rPr>
-                <w:rFonts w:ascii="Aptos" w:hAnsi="Aptos"/>
-                <w:b/>
-                <w:color w:val="0F513A"/>
-                <w:sz w:val="21"/>
-              </w:rPr>
-              <w:t xml:space="preserve">Security: </w:t>
-            </w:r>
-            <w:r>
-              <w:rPr>
-                <w:rFonts w:ascii="Aptos" w:hAnsi="Aptos"/>
-                <w:b w:val="0"/>
-                <w:color w:val="1B2420"/>
-                <w:sz w:val="21"/>
-              </w:rPr>
-              <w:t>Never share passwords, expose customer data, or leave a shared counter signed in. Verify the customer before revealing gift-card or reward information.</w:t>
-            </w:r>
-          </w:p>
-        </w:tc>
-      </w:tr>
-    </w:tbl>
     <w:p>
       <w:pPr>
-        <w:spacing w:after="20"/>
+        <w:spacing w:before="100" w:after="160"/>
+        <w:ind w:left="173" w:right="173"/>
+        <w:shd w:fill="EDF5F1"/>
       </w:pPr>
+      <w:r>
+        <w:rPr>
+          <w:rFonts w:ascii="Aptos" w:hAnsi="Aptos"/>
+          <w:b/>
+          <w:color w:val="0F513A"/>
+          <w:sz w:val="21"/>
+        </w:rPr>
+        <w:t xml:space="preserve">Security: </w:t>
+      </w:r>
+      <w:r>
+        <w:rPr>
+          <w:rFonts w:ascii="Aptos" w:hAnsi="Aptos"/>
+          <w:b w:val="0"/>
+          <w:color w:val="1B2420"/>
+          <w:sz w:val="21"/>
+        </w:rPr>
+        <w:t>Never share passwords, expose customer data, or leave a shared counter signed in. Verify the customer before revealing gift-card or reward information.</w:t>
+      </w:r>
     </w:p>
     <w:sectPr>
       <w:headerReference w:type="default" r:id="rId9"/>

</xml_diff>